<commit_message>
Add lab 1 - Second time
</commit_message>
<xml_diff>
--- a/LAB_1/25521062_BTTH1.docx
+++ b/LAB_1/25521062_BTTH1.docx
@@ -478,7 +478,61 @@
           <w:sz w:val="26"/>
           <w:szCs w:val="26"/>
         </w:rPr>
-        <w:t xml:space="preserve">inh viên thực hiện: </w:t>
+        <w:t xml:space="preserve">inh </w:t>
+      </w:r>
+      <w:proofErr w:type="spellStart"/>
+      <w:r>
+        <w:rPr>
+          <w:color w:val="000000" w:themeColor="text1"/>
+          <w:sz w:val="26"/>
+          <w:szCs w:val="26"/>
+        </w:rPr>
+        <w:t>viên</w:t>
+      </w:r>
+      <w:proofErr w:type="spellEnd"/>
+      <w:r>
+        <w:rPr>
+          <w:color w:val="000000" w:themeColor="text1"/>
+          <w:sz w:val="26"/>
+          <w:szCs w:val="26"/>
+        </w:rPr>
+        <w:t xml:space="preserve"> </w:t>
+      </w:r>
+      <w:proofErr w:type="spellStart"/>
+      <w:r>
+        <w:rPr>
+          <w:color w:val="000000" w:themeColor="text1"/>
+          <w:sz w:val="26"/>
+          <w:szCs w:val="26"/>
+        </w:rPr>
+        <w:t>thực</w:t>
+      </w:r>
+      <w:proofErr w:type="spellEnd"/>
+      <w:r>
+        <w:rPr>
+          <w:color w:val="000000" w:themeColor="text1"/>
+          <w:sz w:val="26"/>
+          <w:szCs w:val="26"/>
+        </w:rPr>
+        <w:t xml:space="preserve"> </w:t>
+      </w:r>
+      <w:proofErr w:type="spellStart"/>
+      <w:r>
+        <w:rPr>
+          <w:color w:val="000000" w:themeColor="text1"/>
+          <w:sz w:val="26"/>
+          <w:szCs w:val="26"/>
+        </w:rPr>
+        <w:t>hiện</w:t>
+      </w:r>
+      <w:proofErr w:type="spellEnd"/>
+      <w:r>
+        <w:rPr>
+          <w:color w:val="000000" w:themeColor="text1"/>
+          <w:sz w:val="26"/>
+          <w:szCs w:val="26"/>
+        </w:rPr>
+        <w:t xml:space="preserve">: </w:t>
       </w:r>
       <w:r>
         <w:rPr>
@@ -618,7 +672,27 @@
           <w:sz w:val="26"/>
           <w:szCs w:val="26"/>
         </w:rPr>
-        <w:t xml:space="preserve">Tp. Hồ Chí Minh, </w:t>
+        <w:t xml:space="preserve">Tp. </w:t>
+      </w:r>
+      <w:proofErr w:type="spellStart"/>
+      <w:r>
+        <w:rPr>
+          <w:bCs/>
+          <w:color w:val="000000" w:themeColor="text1"/>
+          <w:sz w:val="26"/>
+          <w:szCs w:val="26"/>
+        </w:rPr>
+        <w:t>Hồ</w:t>
+      </w:r>
+      <w:proofErr w:type="spellEnd"/>
+      <w:r>
+        <w:rPr>
+          <w:bCs/>
+          <w:color w:val="000000" w:themeColor="text1"/>
+          <w:sz w:val="26"/>
+          <w:szCs w:val="26"/>
+        </w:rPr>
+        <w:t xml:space="preserve"> Chí Minh, </w:t>
       </w:r>
       <w:r>
         <w:rPr>
@@ -1235,7 +1309,73 @@
           <w:sz w:val="26"/>
           <w:szCs w:val="26"/>
         </w:rPr>
-        <w:t>……., ngày……...tháng……năm 202</w:t>
+        <w:t xml:space="preserve">……., </w:t>
+      </w:r>
+      <w:proofErr w:type="spellStart"/>
+      <w:r>
+        <w:rPr>
+          <w:i/>
+          <w:iCs/>
+          <w:color w:val="000000" w:themeColor="text1"/>
+          <w:sz w:val="26"/>
+          <w:szCs w:val="26"/>
+        </w:rPr>
+        <w:t>ngày</w:t>
+      </w:r>
+      <w:proofErr w:type="spellEnd"/>
+      <w:r>
+        <w:rPr>
+          <w:i/>
+          <w:iCs/>
+          <w:color w:val="000000" w:themeColor="text1"/>
+          <w:sz w:val="26"/>
+          <w:szCs w:val="26"/>
+        </w:rPr>
+        <w:t>……...</w:t>
+      </w:r>
+      <w:proofErr w:type="spellStart"/>
+      <w:r>
+        <w:rPr>
+          <w:i/>
+          <w:iCs/>
+          <w:color w:val="000000" w:themeColor="text1"/>
+          <w:sz w:val="26"/>
+          <w:szCs w:val="26"/>
+        </w:rPr>
+        <w:t>tháng</w:t>
+      </w:r>
+      <w:proofErr w:type="spellEnd"/>
+      <w:r>
+        <w:rPr>
+          <w:i/>
+          <w:iCs/>
+          <w:color w:val="000000" w:themeColor="text1"/>
+          <w:sz w:val="26"/>
+          <w:szCs w:val="26"/>
+        </w:rPr>
+        <w:t>……</w:t>
+      </w:r>
+      <w:proofErr w:type="spellStart"/>
+      <w:r>
+        <w:rPr>
+          <w:i/>
+          <w:iCs/>
+          <w:color w:val="000000" w:themeColor="text1"/>
+          <w:sz w:val="26"/>
+          <w:szCs w:val="26"/>
+        </w:rPr>
+        <w:t>năm</w:t>
+      </w:r>
+      <w:proofErr w:type="spellEnd"/>
+      <w:r>
+        <w:rPr>
+          <w:i/>
+          <w:iCs/>
+          <w:color w:val="000000" w:themeColor="text1"/>
+          <w:sz w:val="26"/>
+          <w:szCs w:val="26"/>
+        </w:rPr>
+        <w:t xml:space="preserve"> 202</w:t>
       </w:r>
       <w:r>
         <w:rPr>
@@ -1270,7 +1410,72 @@
           <w:szCs w:val="26"/>
         </w:rPr>
         <w:tab/>
-        <w:t xml:space="preserve">Người nhận xét </w:t>
+      </w:r>
+      <w:proofErr w:type="spellStart"/>
+      <w:r>
+        <w:rPr>
+          <w:b/>
+          <w:bCs/>
+          <w:color w:val="000000" w:themeColor="text1"/>
+          <w:sz w:val="26"/>
+          <w:szCs w:val="26"/>
+        </w:rPr>
+        <w:t>Người</w:t>
+      </w:r>
+      <w:proofErr w:type="spellEnd"/>
+      <w:r>
+        <w:rPr>
+          <w:b/>
+          <w:bCs/>
+          <w:color w:val="000000" w:themeColor="text1"/>
+          <w:sz w:val="26"/>
+          <w:szCs w:val="26"/>
+        </w:rPr>
+        <w:t xml:space="preserve"> </w:t>
+      </w:r>
+      <w:proofErr w:type="spellStart"/>
+      <w:r>
+        <w:rPr>
+          <w:b/>
+          <w:bCs/>
+          <w:color w:val="000000" w:themeColor="text1"/>
+          <w:sz w:val="26"/>
+          <w:szCs w:val="26"/>
+        </w:rPr>
+        <w:t>nhận</w:t>
+      </w:r>
+      <w:proofErr w:type="spellEnd"/>
+      <w:r>
+        <w:rPr>
+          <w:b/>
+          <w:bCs/>
+          <w:color w:val="000000" w:themeColor="text1"/>
+          <w:sz w:val="26"/>
+          <w:szCs w:val="26"/>
+        </w:rPr>
+        <w:t xml:space="preserve"> </w:t>
+      </w:r>
+      <w:proofErr w:type="spellStart"/>
+      <w:r>
+        <w:rPr>
+          <w:b/>
+          <w:bCs/>
+          <w:color w:val="000000" w:themeColor="text1"/>
+          <w:sz w:val="26"/>
+          <w:szCs w:val="26"/>
+        </w:rPr>
+        <w:t>xét</w:t>
+      </w:r>
+      <w:proofErr w:type="spellEnd"/>
+      <w:r>
+        <w:rPr>
+          <w:b/>
+          <w:bCs/>
+          <w:color w:val="000000" w:themeColor="text1"/>
+          <w:sz w:val="26"/>
+          <w:szCs w:val="26"/>
+        </w:rPr>
+        <w:t xml:space="preserve"> </w:t>
       </w:r>
     </w:p>
     <w:p>
@@ -1311,8 +1516,165 @@
           <w:sz w:val="26"/>
           <w:szCs w:val="26"/>
         </w:rPr>
-        <w:t>(Ký tên và ghi rõ họ tên</w:t>
-      </w:r>
+        <w:t>(</w:t>
+      </w:r>
+      <w:proofErr w:type="spellStart"/>
+      <w:r>
+        <w:rPr>
+          <w:bCs/>
+          <w:i/>
+          <w:iCs/>
+          <w:color w:val="000000" w:themeColor="text1"/>
+          <w:sz w:val="26"/>
+          <w:szCs w:val="26"/>
+        </w:rPr>
+        <w:t>Ký</w:t>
+      </w:r>
+      <w:proofErr w:type="spellEnd"/>
+      <w:r>
+        <w:rPr>
+          <w:bCs/>
+          <w:i/>
+          <w:iCs/>
+          <w:color w:val="000000" w:themeColor="text1"/>
+          <w:sz w:val="26"/>
+          <w:szCs w:val="26"/>
+        </w:rPr>
+        <w:t xml:space="preserve"> </w:t>
+      </w:r>
+      <w:proofErr w:type="spellStart"/>
+      <w:r>
+        <w:rPr>
+          <w:bCs/>
+          <w:i/>
+          <w:iCs/>
+          <w:color w:val="000000" w:themeColor="text1"/>
+          <w:sz w:val="26"/>
+          <w:szCs w:val="26"/>
+        </w:rPr>
+        <w:t>tên</w:t>
+      </w:r>
+      <w:proofErr w:type="spellEnd"/>
+      <w:r>
+        <w:rPr>
+          <w:bCs/>
+          <w:i/>
+          <w:iCs/>
+          <w:color w:val="000000" w:themeColor="text1"/>
+          <w:sz w:val="26"/>
+          <w:szCs w:val="26"/>
+        </w:rPr>
+        <w:t xml:space="preserve"> </w:t>
+      </w:r>
+      <w:proofErr w:type="spellStart"/>
+      <w:r>
+        <w:rPr>
+          <w:bCs/>
+          <w:i/>
+          <w:iCs/>
+          <w:color w:val="000000" w:themeColor="text1"/>
+          <w:sz w:val="26"/>
+          <w:szCs w:val="26"/>
+        </w:rPr>
+        <w:t>và</w:t>
+      </w:r>
+      <w:proofErr w:type="spellEnd"/>
+      <w:r>
+        <w:rPr>
+          <w:bCs/>
+          <w:i/>
+          <w:iCs/>
+          <w:color w:val="000000" w:themeColor="text1"/>
+          <w:sz w:val="26"/>
+          <w:szCs w:val="26"/>
+        </w:rPr>
+        <w:t xml:space="preserve"> </w:t>
+      </w:r>
+      <w:proofErr w:type="spellStart"/>
+      <w:r>
+        <w:rPr>
+          <w:bCs/>
+          <w:i/>
+          <w:iCs/>
+          <w:color w:val="000000" w:themeColor="text1"/>
+          <w:sz w:val="26"/>
+          <w:szCs w:val="26"/>
+        </w:rPr>
+        <w:t>ghi</w:t>
+      </w:r>
+      <w:proofErr w:type="spellEnd"/>
+      <w:r>
+        <w:rPr>
+          <w:bCs/>
+          <w:i/>
+          <w:iCs/>
+          <w:color w:val="000000" w:themeColor="text1"/>
+          <w:sz w:val="26"/>
+          <w:szCs w:val="26"/>
+        </w:rPr>
+        <w:t xml:space="preserve"> </w:t>
+      </w:r>
+      <w:proofErr w:type="spellStart"/>
+      <w:r>
+        <w:rPr>
+          <w:bCs/>
+          <w:i/>
+          <w:iCs/>
+          <w:color w:val="000000" w:themeColor="text1"/>
+          <w:sz w:val="26"/>
+          <w:szCs w:val="26"/>
+        </w:rPr>
+        <w:t>rõ</w:t>
+      </w:r>
+      <w:proofErr w:type="spellEnd"/>
+      <w:r>
+        <w:rPr>
+          <w:bCs/>
+          <w:i/>
+          <w:iCs/>
+          <w:color w:val="000000" w:themeColor="text1"/>
+          <w:sz w:val="26"/>
+          <w:szCs w:val="26"/>
+        </w:rPr>
+        <w:t xml:space="preserve"> </w:t>
+      </w:r>
+      <w:proofErr w:type="spellStart"/>
+      <w:r>
+        <w:rPr>
+          <w:bCs/>
+          <w:i/>
+          <w:iCs/>
+          <w:color w:val="000000" w:themeColor="text1"/>
+          <w:sz w:val="26"/>
+          <w:szCs w:val="26"/>
+        </w:rPr>
+        <w:t>họ</w:t>
+      </w:r>
+      <w:proofErr w:type="spellEnd"/>
+      <w:r>
+        <w:rPr>
+          <w:bCs/>
+          <w:i/>
+          <w:iCs/>
+          <w:color w:val="000000" w:themeColor="text1"/>
+          <w:sz w:val="26"/>
+          <w:szCs w:val="26"/>
+        </w:rPr>
+        <w:t xml:space="preserve"> </w:t>
+      </w:r>
+      <w:proofErr w:type="spellStart"/>
+      <w:r>
+        <w:rPr>
+          <w:bCs/>
+          <w:i/>
+          <w:iCs/>
+          <w:color w:val="000000" w:themeColor="text1"/>
+          <w:sz w:val="26"/>
+          <w:szCs w:val="26"/>
+        </w:rPr>
+        <w:t>tên</w:t>
+      </w:r>
+      <w:proofErr w:type="spellEnd"/>
       <w:r>
         <w:rPr>
           <w:b/>
@@ -1767,6 +2129,7 @@
           <w:szCs w:val="28"/>
         </w:rPr>
       </w:pPr>
+      <w:proofErr w:type="spellStart"/>
       <w:r>
         <w:rPr>
           <w:rFonts w:ascii="Times New Roman" w:hAnsi="Times New Roman" w:cs="Times New Roman"/>
@@ -1776,17 +2139,395 @@
           <w:sz w:val="28"/>
           <w:szCs w:val="28"/>
         </w:rPr>
-        <w:t xml:space="preserve">Bài tập 1: </w:t>
-      </w:r>
-      <w:r>
-        <w:rPr>
-          <w:rFonts w:ascii="Times New Roman" w:hAnsi="Times New Roman" w:cs="Times New Roman"/>
-          <w:bCs/>
-          <w:color w:val="000000" w:themeColor="text1"/>
-          <w:sz w:val="28"/>
-          <w:szCs w:val="28"/>
-        </w:rPr>
-        <w:t>Viết chương trình nhập vào một phân số, rút gọn phân số và xuất kết quả.</w:t>
+        <w:t>Bài</w:t>
+      </w:r>
+      <w:proofErr w:type="spellEnd"/>
+      <w:r>
+        <w:rPr>
+          <w:rFonts w:ascii="Times New Roman" w:hAnsi="Times New Roman" w:cs="Times New Roman"/>
+          <w:b/>
+          <w:bCs/>
+          <w:color w:val="000000" w:themeColor="text1"/>
+          <w:sz w:val="28"/>
+          <w:szCs w:val="28"/>
+        </w:rPr>
+        <w:t xml:space="preserve"> </w:t>
+      </w:r>
+      <w:proofErr w:type="spellStart"/>
+      <w:r>
+        <w:rPr>
+          <w:rFonts w:ascii="Times New Roman" w:hAnsi="Times New Roman" w:cs="Times New Roman"/>
+          <w:b/>
+          <w:bCs/>
+          <w:color w:val="000000" w:themeColor="text1"/>
+          <w:sz w:val="28"/>
+          <w:szCs w:val="28"/>
+        </w:rPr>
+        <w:t>tập</w:t>
+      </w:r>
+      <w:proofErr w:type="spellEnd"/>
+      <w:r>
+        <w:rPr>
+          <w:rFonts w:ascii="Times New Roman" w:hAnsi="Times New Roman" w:cs="Times New Roman"/>
+          <w:b/>
+          <w:bCs/>
+          <w:color w:val="000000" w:themeColor="text1"/>
+          <w:sz w:val="28"/>
+          <w:szCs w:val="28"/>
+        </w:rPr>
+        <w:t xml:space="preserve"> 1: </w:t>
+      </w:r>
+      <w:proofErr w:type="spellStart"/>
+      <w:r>
+        <w:rPr>
+          <w:rFonts w:ascii="Times New Roman" w:hAnsi="Times New Roman" w:cs="Times New Roman"/>
+          <w:bCs/>
+          <w:color w:val="000000" w:themeColor="text1"/>
+          <w:sz w:val="28"/>
+          <w:szCs w:val="28"/>
+        </w:rPr>
+        <w:t>Viết</w:t>
+      </w:r>
+      <w:proofErr w:type="spellEnd"/>
+      <w:r>
+        <w:rPr>
+          <w:rFonts w:ascii="Times New Roman" w:hAnsi="Times New Roman" w:cs="Times New Roman"/>
+          <w:bCs/>
+          <w:color w:val="000000" w:themeColor="text1"/>
+          <w:sz w:val="28"/>
+          <w:szCs w:val="28"/>
+        </w:rPr>
+        <w:t xml:space="preserve"> </w:t>
+      </w:r>
+      <w:proofErr w:type="spellStart"/>
+      <w:r>
+        <w:rPr>
+          <w:rFonts w:ascii="Times New Roman" w:hAnsi="Times New Roman" w:cs="Times New Roman"/>
+          <w:bCs/>
+          <w:color w:val="000000" w:themeColor="text1"/>
+          <w:sz w:val="28"/>
+          <w:szCs w:val="28"/>
+        </w:rPr>
+        <w:t>chương</w:t>
+      </w:r>
+      <w:proofErr w:type="spellEnd"/>
+      <w:r>
+        <w:rPr>
+          <w:rFonts w:ascii="Times New Roman" w:hAnsi="Times New Roman" w:cs="Times New Roman"/>
+          <w:bCs/>
+          <w:color w:val="000000" w:themeColor="text1"/>
+          <w:sz w:val="28"/>
+          <w:szCs w:val="28"/>
+        </w:rPr>
+        <w:t xml:space="preserve"> </w:t>
+      </w:r>
+      <w:proofErr w:type="spellStart"/>
+      <w:r>
+        <w:rPr>
+          <w:rFonts w:ascii="Times New Roman" w:hAnsi="Times New Roman" w:cs="Times New Roman"/>
+          <w:bCs/>
+          <w:color w:val="000000" w:themeColor="text1"/>
+          <w:sz w:val="28"/>
+          <w:szCs w:val="28"/>
+        </w:rPr>
+        <w:t>trình</w:t>
+      </w:r>
+      <w:proofErr w:type="spellEnd"/>
+      <w:r>
+        <w:rPr>
+          <w:rFonts w:ascii="Times New Roman" w:hAnsi="Times New Roman" w:cs="Times New Roman"/>
+          <w:bCs/>
+          <w:color w:val="000000" w:themeColor="text1"/>
+          <w:sz w:val="28"/>
+          <w:szCs w:val="28"/>
+        </w:rPr>
+        <w:t xml:space="preserve"> </w:t>
+      </w:r>
+      <w:proofErr w:type="spellStart"/>
+      <w:r>
+        <w:rPr>
+          <w:rFonts w:ascii="Times New Roman" w:hAnsi="Times New Roman" w:cs="Times New Roman"/>
+          <w:bCs/>
+          <w:color w:val="000000" w:themeColor="text1"/>
+          <w:sz w:val="28"/>
+          <w:szCs w:val="28"/>
+        </w:rPr>
+        <w:t>nhập</w:t>
+      </w:r>
+      <w:proofErr w:type="spellEnd"/>
+      <w:r>
+        <w:rPr>
+          <w:rFonts w:ascii="Times New Roman" w:hAnsi="Times New Roman" w:cs="Times New Roman"/>
+          <w:bCs/>
+          <w:color w:val="000000" w:themeColor="text1"/>
+          <w:sz w:val="28"/>
+          <w:szCs w:val="28"/>
+        </w:rPr>
+        <w:t xml:space="preserve"> </w:t>
+      </w:r>
+      <w:proofErr w:type="spellStart"/>
+      <w:r>
+        <w:rPr>
+          <w:rFonts w:ascii="Times New Roman" w:hAnsi="Times New Roman" w:cs="Times New Roman"/>
+          <w:bCs/>
+          <w:color w:val="000000" w:themeColor="text1"/>
+          <w:sz w:val="28"/>
+          <w:szCs w:val="28"/>
+        </w:rPr>
+        <w:t>vào</w:t>
+      </w:r>
+      <w:proofErr w:type="spellEnd"/>
+      <w:r>
+        <w:rPr>
+          <w:rFonts w:ascii="Times New Roman" w:hAnsi="Times New Roman" w:cs="Times New Roman"/>
+          <w:bCs/>
+          <w:color w:val="000000" w:themeColor="text1"/>
+          <w:sz w:val="28"/>
+          <w:szCs w:val="28"/>
+        </w:rPr>
+        <w:t xml:space="preserve"> </w:t>
+      </w:r>
+      <w:proofErr w:type="spellStart"/>
+      <w:r>
+        <w:rPr>
+          <w:rFonts w:ascii="Times New Roman" w:hAnsi="Times New Roman" w:cs="Times New Roman"/>
+          <w:bCs/>
+          <w:color w:val="000000" w:themeColor="text1"/>
+          <w:sz w:val="28"/>
+          <w:szCs w:val="28"/>
+        </w:rPr>
+        <w:t>một</w:t>
+      </w:r>
+      <w:proofErr w:type="spellEnd"/>
+      <w:r>
+        <w:rPr>
+          <w:rFonts w:ascii="Times New Roman" w:hAnsi="Times New Roman" w:cs="Times New Roman"/>
+          <w:bCs/>
+          <w:color w:val="000000" w:themeColor="text1"/>
+          <w:sz w:val="28"/>
+          <w:szCs w:val="28"/>
+        </w:rPr>
+        <w:t xml:space="preserve"> </w:t>
+      </w:r>
+      <w:proofErr w:type="spellStart"/>
+      <w:r>
+        <w:rPr>
+          <w:rFonts w:ascii="Times New Roman" w:hAnsi="Times New Roman" w:cs="Times New Roman"/>
+          <w:bCs/>
+          <w:color w:val="000000" w:themeColor="text1"/>
+          <w:sz w:val="28"/>
+          <w:szCs w:val="28"/>
+        </w:rPr>
+        <w:t>phân</w:t>
+      </w:r>
+      <w:proofErr w:type="spellEnd"/>
+      <w:r>
+        <w:rPr>
+          <w:rFonts w:ascii="Times New Roman" w:hAnsi="Times New Roman" w:cs="Times New Roman"/>
+          <w:bCs/>
+          <w:color w:val="000000" w:themeColor="text1"/>
+          <w:sz w:val="28"/>
+          <w:szCs w:val="28"/>
+        </w:rPr>
+        <w:t xml:space="preserve"> </w:t>
+      </w:r>
+      <w:proofErr w:type="spellStart"/>
+      <w:r>
+        <w:rPr>
+          <w:rFonts w:ascii="Times New Roman" w:hAnsi="Times New Roman" w:cs="Times New Roman"/>
+          <w:bCs/>
+          <w:color w:val="000000" w:themeColor="text1"/>
+          <w:sz w:val="28"/>
+          <w:szCs w:val="28"/>
+        </w:rPr>
+        <w:t>số</w:t>
+      </w:r>
+      <w:proofErr w:type="spellEnd"/>
+      <w:r>
+        <w:rPr>
+          <w:rFonts w:ascii="Times New Roman" w:hAnsi="Times New Roman" w:cs="Times New Roman"/>
+          <w:bCs/>
+          <w:color w:val="000000" w:themeColor="text1"/>
+          <w:sz w:val="28"/>
+          <w:szCs w:val="28"/>
+        </w:rPr>
+        <w:t xml:space="preserve">, </w:t>
+      </w:r>
+      <w:proofErr w:type="spellStart"/>
+      <w:r>
+        <w:rPr>
+          <w:rFonts w:ascii="Times New Roman" w:hAnsi="Times New Roman" w:cs="Times New Roman"/>
+          <w:bCs/>
+          <w:color w:val="000000" w:themeColor="text1"/>
+          <w:sz w:val="28"/>
+          <w:szCs w:val="28"/>
+        </w:rPr>
+        <w:t>rút</w:t>
+      </w:r>
+      <w:proofErr w:type="spellEnd"/>
+      <w:r>
+        <w:rPr>
+          <w:rFonts w:ascii="Times New Roman" w:hAnsi="Times New Roman" w:cs="Times New Roman"/>
+          <w:bCs/>
+          <w:color w:val="000000" w:themeColor="text1"/>
+          <w:sz w:val="28"/>
+          <w:szCs w:val="28"/>
+        </w:rPr>
+        <w:t xml:space="preserve"> </w:t>
+      </w:r>
+      <w:proofErr w:type="spellStart"/>
+      <w:r>
+        <w:rPr>
+          <w:rFonts w:ascii="Times New Roman" w:hAnsi="Times New Roman" w:cs="Times New Roman"/>
+          <w:bCs/>
+          <w:color w:val="000000" w:themeColor="text1"/>
+          <w:sz w:val="28"/>
+          <w:szCs w:val="28"/>
+        </w:rPr>
+        <w:t>gọn</w:t>
+      </w:r>
+      <w:proofErr w:type="spellEnd"/>
+      <w:r>
+        <w:rPr>
+          <w:rFonts w:ascii="Times New Roman" w:hAnsi="Times New Roman" w:cs="Times New Roman"/>
+          <w:bCs/>
+          <w:color w:val="000000" w:themeColor="text1"/>
+          <w:sz w:val="28"/>
+          <w:szCs w:val="28"/>
+        </w:rPr>
+        <w:t xml:space="preserve"> </w:t>
+      </w:r>
+      <w:proofErr w:type="spellStart"/>
+      <w:r>
+        <w:rPr>
+          <w:rFonts w:ascii="Times New Roman" w:hAnsi="Times New Roman" w:cs="Times New Roman"/>
+          <w:bCs/>
+          <w:color w:val="000000" w:themeColor="text1"/>
+          <w:sz w:val="28"/>
+          <w:szCs w:val="28"/>
+        </w:rPr>
+        <w:t>phân</w:t>
+      </w:r>
+      <w:proofErr w:type="spellEnd"/>
+      <w:r>
+        <w:rPr>
+          <w:rFonts w:ascii="Times New Roman" w:hAnsi="Times New Roman" w:cs="Times New Roman"/>
+          <w:bCs/>
+          <w:color w:val="000000" w:themeColor="text1"/>
+          <w:sz w:val="28"/>
+          <w:szCs w:val="28"/>
+        </w:rPr>
+        <w:t xml:space="preserve"> </w:t>
+      </w:r>
+      <w:proofErr w:type="spellStart"/>
+      <w:r>
+        <w:rPr>
+          <w:rFonts w:ascii="Times New Roman" w:hAnsi="Times New Roman" w:cs="Times New Roman"/>
+          <w:bCs/>
+          <w:color w:val="000000" w:themeColor="text1"/>
+          <w:sz w:val="28"/>
+          <w:szCs w:val="28"/>
+        </w:rPr>
+        <w:t>số</w:t>
+      </w:r>
+      <w:proofErr w:type="spellEnd"/>
+      <w:r>
+        <w:rPr>
+          <w:rFonts w:ascii="Times New Roman" w:hAnsi="Times New Roman" w:cs="Times New Roman"/>
+          <w:bCs/>
+          <w:color w:val="000000" w:themeColor="text1"/>
+          <w:sz w:val="28"/>
+          <w:szCs w:val="28"/>
+        </w:rPr>
+        <w:t xml:space="preserve"> </w:t>
+      </w:r>
+      <w:proofErr w:type="spellStart"/>
+      <w:r>
+        <w:rPr>
+          <w:rFonts w:ascii="Times New Roman" w:hAnsi="Times New Roman" w:cs="Times New Roman"/>
+          <w:bCs/>
+          <w:color w:val="000000" w:themeColor="text1"/>
+          <w:sz w:val="28"/>
+          <w:szCs w:val="28"/>
+        </w:rPr>
+        <w:t>và</w:t>
+      </w:r>
+      <w:proofErr w:type="spellEnd"/>
+      <w:r>
+        <w:rPr>
+          <w:rFonts w:ascii="Times New Roman" w:hAnsi="Times New Roman" w:cs="Times New Roman"/>
+          <w:bCs/>
+          <w:color w:val="000000" w:themeColor="text1"/>
+          <w:sz w:val="28"/>
+          <w:szCs w:val="28"/>
+        </w:rPr>
+        <w:t xml:space="preserve"> </w:t>
+      </w:r>
+      <w:proofErr w:type="spellStart"/>
+      <w:r>
+        <w:rPr>
+          <w:rFonts w:ascii="Times New Roman" w:hAnsi="Times New Roman" w:cs="Times New Roman"/>
+          <w:bCs/>
+          <w:color w:val="000000" w:themeColor="text1"/>
+          <w:sz w:val="28"/>
+          <w:szCs w:val="28"/>
+        </w:rPr>
+        <w:t>xuất</w:t>
+      </w:r>
+      <w:proofErr w:type="spellEnd"/>
+      <w:r>
+        <w:rPr>
+          <w:rFonts w:ascii="Times New Roman" w:hAnsi="Times New Roman" w:cs="Times New Roman"/>
+          <w:bCs/>
+          <w:color w:val="000000" w:themeColor="text1"/>
+          <w:sz w:val="28"/>
+          <w:szCs w:val="28"/>
+        </w:rPr>
+        <w:t xml:space="preserve"> </w:t>
+      </w:r>
+      <w:proofErr w:type="spellStart"/>
+      <w:r>
+        <w:rPr>
+          <w:rFonts w:ascii="Times New Roman" w:hAnsi="Times New Roman" w:cs="Times New Roman"/>
+          <w:bCs/>
+          <w:color w:val="000000" w:themeColor="text1"/>
+          <w:sz w:val="28"/>
+          <w:szCs w:val="28"/>
+        </w:rPr>
+        <w:t>kết</w:t>
+      </w:r>
+      <w:proofErr w:type="spellEnd"/>
+      <w:r>
+        <w:rPr>
+          <w:rFonts w:ascii="Times New Roman" w:hAnsi="Times New Roman" w:cs="Times New Roman"/>
+          <w:bCs/>
+          <w:color w:val="000000" w:themeColor="text1"/>
+          <w:sz w:val="28"/>
+          <w:szCs w:val="28"/>
+        </w:rPr>
+        <w:t xml:space="preserve"> </w:t>
+      </w:r>
+      <w:proofErr w:type="spellStart"/>
+      <w:r>
+        <w:rPr>
+          <w:rFonts w:ascii="Times New Roman" w:hAnsi="Times New Roman" w:cs="Times New Roman"/>
+          <w:bCs/>
+          <w:color w:val="000000" w:themeColor="text1"/>
+          <w:sz w:val="28"/>
+          <w:szCs w:val="28"/>
+        </w:rPr>
+        <w:t>quả</w:t>
+      </w:r>
+      <w:proofErr w:type="spellEnd"/>
+      <w:r>
+        <w:rPr>
+          <w:rFonts w:ascii="Times New Roman" w:hAnsi="Times New Roman" w:cs="Times New Roman"/>
+          <w:bCs/>
+          <w:color w:val="000000" w:themeColor="text1"/>
+          <w:sz w:val="28"/>
+          <w:szCs w:val="28"/>
+        </w:rPr>
+        <w:t>.</w:t>
       </w:r>
     </w:p>
     <w:p>
@@ -1800,6 +2541,7 @@
           <w:szCs w:val="28"/>
         </w:rPr>
       </w:pPr>
+      <w:proofErr w:type="spellStart"/>
       <w:r>
         <w:rPr>
           <w:rFonts w:ascii="Times New Roman" w:hAnsi="Times New Roman" w:cs="Times New Roman"/>
@@ -1809,17 +2551,417 @@
           <w:sz w:val="28"/>
           <w:szCs w:val="28"/>
         </w:rPr>
-        <w:t xml:space="preserve">Bài tập 2: </w:t>
-      </w:r>
-      <w:r>
-        <w:rPr>
-          <w:rFonts w:ascii="Times New Roman" w:hAnsi="Times New Roman" w:cs="Times New Roman"/>
-          <w:bCs/>
-          <w:color w:val="000000" w:themeColor="text1"/>
-          <w:sz w:val="28"/>
-          <w:szCs w:val="28"/>
-        </w:rPr>
-        <w:t>Viết chương trình nhập vào hai phân số, tìm phân số lớn nhất và xuất kết quả.</w:t>
+        <w:t>Bài</w:t>
+      </w:r>
+      <w:proofErr w:type="spellEnd"/>
+      <w:r>
+        <w:rPr>
+          <w:rFonts w:ascii="Times New Roman" w:hAnsi="Times New Roman" w:cs="Times New Roman"/>
+          <w:b/>
+          <w:bCs/>
+          <w:color w:val="000000" w:themeColor="text1"/>
+          <w:sz w:val="28"/>
+          <w:szCs w:val="28"/>
+        </w:rPr>
+        <w:t xml:space="preserve"> </w:t>
+      </w:r>
+      <w:proofErr w:type="spellStart"/>
+      <w:r>
+        <w:rPr>
+          <w:rFonts w:ascii="Times New Roman" w:hAnsi="Times New Roman" w:cs="Times New Roman"/>
+          <w:b/>
+          <w:bCs/>
+          <w:color w:val="000000" w:themeColor="text1"/>
+          <w:sz w:val="28"/>
+          <w:szCs w:val="28"/>
+        </w:rPr>
+        <w:t>tập</w:t>
+      </w:r>
+      <w:proofErr w:type="spellEnd"/>
+      <w:r>
+        <w:rPr>
+          <w:rFonts w:ascii="Times New Roman" w:hAnsi="Times New Roman" w:cs="Times New Roman"/>
+          <w:b/>
+          <w:bCs/>
+          <w:color w:val="000000" w:themeColor="text1"/>
+          <w:sz w:val="28"/>
+          <w:szCs w:val="28"/>
+        </w:rPr>
+        <w:t xml:space="preserve"> 2: </w:t>
+      </w:r>
+      <w:proofErr w:type="spellStart"/>
+      <w:r>
+        <w:rPr>
+          <w:rFonts w:ascii="Times New Roman" w:hAnsi="Times New Roman" w:cs="Times New Roman"/>
+          <w:bCs/>
+          <w:color w:val="000000" w:themeColor="text1"/>
+          <w:sz w:val="28"/>
+          <w:szCs w:val="28"/>
+        </w:rPr>
+        <w:t>Viết</w:t>
+      </w:r>
+      <w:proofErr w:type="spellEnd"/>
+      <w:r>
+        <w:rPr>
+          <w:rFonts w:ascii="Times New Roman" w:hAnsi="Times New Roman" w:cs="Times New Roman"/>
+          <w:bCs/>
+          <w:color w:val="000000" w:themeColor="text1"/>
+          <w:sz w:val="28"/>
+          <w:szCs w:val="28"/>
+        </w:rPr>
+        <w:t xml:space="preserve"> </w:t>
+      </w:r>
+      <w:proofErr w:type="spellStart"/>
+      <w:r>
+        <w:rPr>
+          <w:rFonts w:ascii="Times New Roman" w:hAnsi="Times New Roman" w:cs="Times New Roman"/>
+          <w:bCs/>
+          <w:color w:val="000000" w:themeColor="text1"/>
+          <w:sz w:val="28"/>
+          <w:szCs w:val="28"/>
+        </w:rPr>
+        <w:t>chương</w:t>
+      </w:r>
+      <w:proofErr w:type="spellEnd"/>
+      <w:r>
+        <w:rPr>
+          <w:rFonts w:ascii="Times New Roman" w:hAnsi="Times New Roman" w:cs="Times New Roman"/>
+          <w:bCs/>
+          <w:color w:val="000000" w:themeColor="text1"/>
+          <w:sz w:val="28"/>
+          <w:szCs w:val="28"/>
+        </w:rPr>
+        <w:t xml:space="preserve"> </w:t>
+      </w:r>
+      <w:proofErr w:type="spellStart"/>
+      <w:r>
+        <w:rPr>
+          <w:rFonts w:ascii="Times New Roman" w:hAnsi="Times New Roman" w:cs="Times New Roman"/>
+          <w:bCs/>
+          <w:color w:val="000000" w:themeColor="text1"/>
+          <w:sz w:val="28"/>
+          <w:szCs w:val="28"/>
+        </w:rPr>
+        <w:t>trình</w:t>
+      </w:r>
+      <w:proofErr w:type="spellEnd"/>
+      <w:r>
+        <w:rPr>
+          <w:rFonts w:ascii="Times New Roman" w:hAnsi="Times New Roman" w:cs="Times New Roman"/>
+          <w:bCs/>
+          <w:color w:val="000000" w:themeColor="text1"/>
+          <w:sz w:val="28"/>
+          <w:szCs w:val="28"/>
+        </w:rPr>
+        <w:t xml:space="preserve"> </w:t>
+      </w:r>
+      <w:proofErr w:type="spellStart"/>
+      <w:r>
+        <w:rPr>
+          <w:rFonts w:ascii="Times New Roman" w:hAnsi="Times New Roman" w:cs="Times New Roman"/>
+          <w:bCs/>
+          <w:color w:val="000000" w:themeColor="text1"/>
+          <w:sz w:val="28"/>
+          <w:szCs w:val="28"/>
+        </w:rPr>
+        <w:t>nhập</w:t>
+      </w:r>
+      <w:proofErr w:type="spellEnd"/>
+      <w:r>
+        <w:rPr>
+          <w:rFonts w:ascii="Times New Roman" w:hAnsi="Times New Roman" w:cs="Times New Roman"/>
+          <w:bCs/>
+          <w:color w:val="000000" w:themeColor="text1"/>
+          <w:sz w:val="28"/>
+          <w:szCs w:val="28"/>
+        </w:rPr>
+        <w:t xml:space="preserve"> </w:t>
+      </w:r>
+      <w:proofErr w:type="spellStart"/>
+      <w:r>
+        <w:rPr>
+          <w:rFonts w:ascii="Times New Roman" w:hAnsi="Times New Roman" w:cs="Times New Roman"/>
+          <w:bCs/>
+          <w:color w:val="000000" w:themeColor="text1"/>
+          <w:sz w:val="28"/>
+          <w:szCs w:val="28"/>
+        </w:rPr>
+        <w:t>vào</w:t>
+      </w:r>
+      <w:proofErr w:type="spellEnd"/>
+      <w:r>
+        <w:rPr>
+          <w:rFonts w:ascii="Times New Roman" w:hAnsi="Times New Roman" w:cs="Times New Roman"/>
+          <w:bCs/>
+          <w:color w:val="000000" w:themeColor="text1"/>
+          <w:sz w:val="28"/>
+          <w:szCs w:val="28"/>
+        </w:rPr>
+        <w:t xml:space="preserve"> </w:t>
+      </w:r>
+      <w:proofErr w:type="spellStart"/>
+      <w:r>
+        <w:rPr>
+          <w:rFonts w:ascii="Times New Roman" w:hAnsi="Times New Roman" w:cs="Times New Roman"/>
+          <w:bCs/>
+          <w:color w:val="000000" w:themeColor="text1"/>
+          <w:sz w:val="28"/>
+          <w:szCs w:val="28"/>
+        </w:rPr>
+        <w:t>hai</w:t>
+      </w:r>
+      <w:proofErr w:type="spellEnd"/>
+      <w:r>
+        <w:rPr>
+          <w:rFonts w:ascii="Times New Roman" w:hAnsi="Times New Roman" w:cs="Times New Roman"/>
+          <w:bCs/>
+          <w:color w:val="000000" w:themeColor="text1"/>
+          <w:sz w:val="28"/>
+          <w:szCs w:val="28"/>
+        </w:rPr>
+        <w:t xml:space="preserve"> </w:t>
+      </w:r>
+      <w:proofErr w:type="spellStart"/>
+      <w:r>
+        <w:rPr>
+          <w:rFonts w:ascii="Times New Roman" w:hAnsi="Times New Roman" w:cs="Times New Roman"/>
+          <w:bCs/>
+          <w:color w:val="000000" w:themeColor="text1"/>
+          <w:sz w:val="28"/>
+          <w:szCs w:val="28"/>
+        </w:rPr>
+        <w:t>phân</w:t>
+      </w:r>
+      <w:proofErr w:type="spellEnd"/>
+      <w:r>
+        <w:rPr>
+          <w:rFonts w:ascii="Times New Roman" w:hAnsi="Times New Roman" w:cs="Times New Roman"/>
+          <w:bCs/>
+          <w:color w:val="000000" w:themeColor="text1"/>
+          <w:sz w:val="28"/>
+          <w:szCs w:val="28"/>
+        </w:rPr>
+        <w:t xml:space="preserve"> </w:t>
+      </w:r>
+      <w:proofErr w:type="spellStart"/>
+      <w:r>
+        <w:rPr>
+          <w:rFonts w:ascii="Times New Roman" w:hAnsi="Times New Roman" w:cs="Times New Roman"/>
+          <w:bCs/>
+          <w:color w:val="000000" w:themeColor="text1"/>
+          <w:sz w:val="28"/>
+          <w:szCs w:val="28"/>
+        </w:rPr>
+        <w:t>số</w:t>
+      </w:r>
+      <w:proofErr w:type="spellEnd"/>
+      <w:r>
+        <w:rPr>
+          <w:rFonts w:ascii="Times New Roman" w:hAnsi="Times New Roman" w:cs="Times New Roman"/>
+          <w:bCs/>
+          <w:color w:val="000000" w:themeColor="text1"/>
+          <w:sz w:val="28"/>
+          <w:szCs w:val="28"/>
+        </w:rPr>
+        <w:t xml:space="preserve">, </w:t>
+      </w:r>
+      <w:proofErr w:type="spellStart"/>
+      <w:r>
+        <w:rPr>
+          <w:rFonts w:ascii="Times New Roman" w:hAnsi="Times New Roman" w:cs="Times New Roman"/>
+          <w:bCs/>
+          <w:color w:val="000000" w:themeColor="text1"/>
+          <w:sz w:val="28"/>
+          <w:szCs w:val="28"/>
+        </w:rPr>
+        <w:t>tìm</w:t>
+      </w:r>
+      <w:proofErr w:type="spellEnd"/>
+      <w:r>
+        <w:rPr>
+          <w:rFonts w:ascii="Times New Roman" w:hAnsi="Times New Roman" w:cs="Times New Roman"/>
+          <w:bCs/>
+          <w:color w:val="000000" w:themeColor="text1"/>
+          <w:sz w:val="28"/>
+          <w:szCs w:val="28"/>
+        </w:rPr>
+        <w:t xml:space="preserve"> </w:t>
+      </w:r>
+      <w:proofErr w:type="spellStart"/>
+      <w:r>
+        <w:rPr>
+          <w:rFonts w:ascii="Times New Roman" w:hAnsi="Times New Roman" w:cs="Times New Roman"/>
+          <w:bCs/>
+          <w:color w:val="000000" w:themeColor="text1"/>
+          <w:sz w:val="28"/>
+          <w:szCs w:val="28"/>
+        </w:rPr>
+        <w:t>phân</w:t>
+      </w:r>
+      <w:proofErr w:type="spellEnd"/>
+      <w:r>
+        <w:rPr>
+          <w:rFonts w:ascii="Times New Roman" w:hAnsi="Times New Roman" w:cs="Times New Roman"/>
+          <w:bCs/>
+          <w:color w:val="000000" w:themeColor="text1"/>
+          <w:sz w:val="28"/>
+          <w:szCs w:val="28"/>
+        </w:rPr>
+        <w:t xml:space="preserve"> </w:t>
+      </w:r>
+      <w:proofErr w:type="spellStart"/>
+      <w:r>
+        <w:rPr>
+          <w:rFonts w:ascii="Times New Roman" w:hAnsi="Times New Roman" w:cs="Times New Roman"/>
+          <w:bCs/>
+          <w:color w:val="000000" w:themeColor="text1"/>
+          <w:sz w:val="28"/>
+          <w:szCs w:val="28"/>
+        </w:rPr>
+        <w:t>số</w:t>
+      </w:r>
+      <w:proofErr w:type="spellEnd"/>
+      <w:r>
+        <w:rPr>
+          <w:rFonts w:ascii="Times New Roman" w:hAnsi="Times New Roman" w:cs="Times New Roman"/>
+          <w:bCs/>
+          <w:color w:val="000000" w:themeColor="text1"/>
+          <w:sz w:val="28"/>
+          <w:szCs w:val="28"/>
+        </w:rPr>
+        <w:t xml:space="preserve"> </w:t>
+      </w:r>
+      <w:proofErr w:type="spellStart"/>
+      <w:r>
+        <w:rPr>
+          <w:rFonts w:ascii="Times New Roman" w:hAnsi="Times New Roman" w:cs="Times New Roman"/>
+          <w:bCs/>
+          <w:color w:val="000000" w:themeColor="text1"/>
+          <w:sz w:val="28"/>
+          <w:szCs w:val="28"/>
+        </w:rPr>
+        <w:t>lớn</w:t>
+      </w:r>
+      <w:proofErr w:type="spellEnd"/>
+      <w:r>
+        <w:rPr>
+          <w:rFonts w:ascii="Times New Roman" w:hAnsi="Times New Roman" w:cs="Times New Roman"/>
+          <w:bCs/>
+          <w:color w:val="000000" w:themeColor="text1"/>
+          <w:sz w:val="28"/>
+          <w:szCs w:val="28"/>
+        </w:rPr>
+        <w:t xml:space="preserve"> </w:t>
+      </w:r>
+      <w:proofErr w:type="spellStart"/>
+      <w:r>
+        <w:rPr>
+          <w:rFonts w:ascii="Times New Roman" w:hAnsi="Times New Roman" w:cs="Times New Roman"/>
+          <w:bCs/>
+          <w:color w:val="000000" w:themeColor="text1"/>
+          <w:sz w:val="28"/>
+          <w:szCs w:val="28"/>
+        </w:rPr>
+        <w:t>nhất</w:t>
+      </w:r>
+      <w:proofErr w:type="spellEnd"/>
+      <w:r>
+        <w:rPr>
+          <w:rFonts w:ascii="Times New Roman" w:hAnsi="Times New Roman" w:cs="Times New Roman"/>
+          <w:bCs/>
+          <w:color w:val="000000" w:themeColor="text1"/>
+          <w:sz w:val="28"/>
+          <w:szCs w:val="28"/>
+        </w:rPr>
+        <w:t xml:space="preserve"> </w:t>
+      </w:r>
+      <w:proofErr w:type="spellStart"/>
+      <w:r>
+        <w:rPr>
+          <w:rFonts w:ascii="Times New Roman" w:hAnsi="Times New Roman" w:cs="Times New Roman"/>
+          <w:bCs/>
+          <w:color w:val="000000" w:themeColor="text1"/>
+          <w:sz w:val="28"/>
+          <w:szCs w:val="28"/>
+        </w:rPr>
+        <w:t>và</w:t>
+      </w:r>
+      <w:proofErr w:type="spellEnd"/>
+      <w:r>
+        <w:rPr>
+          <w:rFonts w:ascii="Times New Roman" w:hAnsi="Times New Roman" w:cs="Times New Roman"/>
+          <w:bCs/>
+          <w:color w:val="000000" w:themeColor="text1"/>
+          <w:sz w:val="28"/>
+          <w:szCs w:val="28"/>
+        </w:rPr>
+        <w:t xml:space="preserve"> </w:t>
+      </w:r>
+      <w:proofErr w:type="spellStart"/>
+      <w:r>
+        <w:rPr>
+          <w:rFonts w:ascii="Times New Roman" w:hAnsi="Times New Roman" w:cs="Times New Roman"/>
+          <w:bCs/>
+          <w:color w:val="000000" w:themeColor="text1"/>
+          <w:sz w:val="28"/>
+          <w:szCs w:val="28"/>
+        </w:rPr>
+        <w:t>xuất</w:t>
+      </w:r>
+      <w:proofErr w:type="spellEnd"/>
+      <w:r>
+        <w:rPr>
+          <w:rFonts w:ascii="Times New Roman" w:hAnsi="Times New Roman" w:cs="Times New Roman"/>
+          <w:bCs/>
+          <w:color w:val="000000" w:themeColor="text1"/>
+          <w:sz w:val="28"/>
+          <w:szCs w:val="28"/>
+        </w:rPr>
+        <w:t xml:space="preserve"> </w:t>
+      </w:r>
+      <w:proofErr w:type="spellStart"/>
+      <w:r>
+        <w:rPr>
+          <w:rFonts w:ascii="Times New Roman" w:hAnsi="Times New Roman" w:cs="Times New Roman"/>
+          <w:bCs/>
+          <w:color w:val="000000" w:themeColor="text1"/>
+          <w:sz w:val="28"/>
+          <w:szCs w:val="28"/>
+        </w:rPr>
+        <w:t>kết</w:t>
+      </w:r>
+      <w:proofErr w:type="spellEnd"/>
+      <w:r>
+        <w:rPr>
+          <w:rFonts w:ascii="Times New Roman" w:hAnsi="Times New Roman" w:cs="Times New Roman"/>
+          <w:bCs/>
+          <w:color w:val="000000" w:themeColor="text1"/>
+          <w:sz w:val="28"/>
+          <w:szCs w:val="28"/>
+        </w:rPr>
+        <w:t xml:space="preserve"> </w:t>
+      </w:r>
+      <w:proofErr w:type="spellStart"/>
+      <w:r>
+        <w:rPr>
+          <w:rFonts w:ascii="Times New Roman" w:hAnsi="Times New Roman" w:cs="Times New Roman"/>
+          <w:bCs/>
+          <w:color w:val="000000" w:themeColor="text1"/>
+          <w:sz w:val="28"/>
+          <w:szCs w:val="28"/>
+        </w:rPr>
+        <w:t>quả</w:t>
+      </w:r>
+      <w:proofErr w:type="spellEnd"/>
+      <w:r>
+        <w:rPr>
+          <w:rFonts w:ascii="Times New Roman" w:hAnsi="Times New Roman" w:cs="Times New Roman"/>
+          <w:bCs/>
+          <w:color w:val="000000" w:themeColor="text1"/>
+          <w:sz w:val="28"/>
+          <w:szCs w:val="28"/>
+        </w:rPr>
+        <w:t>.</w:t>
       </w:r>
     </w:p>
     <w:p>
@@ -1833,6 +2975,7 @@
           <w:szCs w:val="28"/>
         </w:rPr>
       </w:pPr>
+      <w:proofErr w:type="spellStart"/>
       <w:r>
         <w:rPr>
           <w:rFonts w:ascii="Times New Roman" w:hAnsi="Times New Roman" w:cs="Times New Roman"/>
@@ -1842,17 +2985,461 @@
           <w:sz w:val="28"/>
           <w:szCs w:val="28"/>
         </w:rPr>
-        <w:t xml:space="preserve">Bài tập 3: </w:t>
-      </w:r>
-      <w:r>
-        <w:rPr>
-          <w:rFonts w:ascii="Times New Roman" w:hAnsi="Times New Roman" w:cs="Times New Roman"/>
-          <w:bCs/>
-          <w:color w:val="000000" w:themeColor="text1"/>
-          <w:sz w:val="28"/>
-          <w:szCs w:val="28"/>
-        </w:rPr>
-        <w:t>Viết chương trình nhập vào hai phân số. Tính tổng, hiệu, tích, thương giữa chúng và xuất kết quả.</w:t>
+        <w:t>Bài</w:t>
+      </w:r>
+      <w:proofErr w:type="spellEnd"/>
+      <w:r>
+        <w:rPr>
+          <w:rFonts w:ascii="Times New Roman" w:hAnsi="Times New Roman" w:cs="Times New Roman"/>
+          <w:b/>
+          <w:bCs/>
+          <w:color w:val="000000" w:themeColor="text1"/>
+          <w:sz w:val="28"/>
+          <w:szCs w:val="28"/>
+        </w:rPr>
+        <w:t xml:space="preserve"> </w:t>
+      </w:r>
+      <w:proofErr w:type="spellStart"/>
+      <w:r>
+        <w:rPr>
+          <w:rFonts w:ascii="Times New Roman" w:hAnsi="Times New Roman" w:cs="Times New Roman"/>
+          <w:b/>
+          <w:bCs/>
+          <w:color w:val="000000" w:themeColor="text1"/>
+          <w:sz w:val="28"/>
+          <w:szCs w:val="28"/>
+        </w:rPr>
+        <w:t>tập</w:t>
+      </w:r>
+      <w:proofErr w:type="spellEnd"/>
+      <w:r>
+        <w:rPr>
+          <w:rFonts w:ascii="Times New Roman" w:hAnsi="Times New Roman" w:cs="Times New Roman"/>
+          <w:b/>
+          <w:bCs/>
+          <w:color w:val="000000" w:themeColor="text1"/>
+          <w:sz w:val="28"/>
+          <w:szCs w:val="28"/>
+        </w:rPr>
+        <w:t xml:space="preserve"> 3: </w:t>
+      </w:r>
+      <w:proofErr w:type="spellStart"/>
+      <w:r>
+        <w:rPr>
+          <w:rFonts w:ascii="Times New Roman" w:hAnsi="Times New Roman" w:cs="Times New Roman"/>
+          <w:bCs/>
+          <w:color w:val="000000" w:themeColor="text1"/>
+          <w:sz w:val="28"/>
+          <w:szCs w:val="28"/>
+        </w:rPr>
+        <w:t>Viết</w:t>
+      </w:r>
+      <w:proofErr w:type="spellEnd"/>
+      <w:r>
+        <w:rPr>
+          <w:rFonts w:ascii="Times New Roman" w:hAnsi="Times New Roman" w:cs="Times New Roman"/>
+          <w:bCs/>
+          <w:color w:val="000000" w:themeColor="text1"/>
+          <w:sz w:val="28"/>
+          <w:szCs w:val="28"/>
+        </w:rPr>
+        <w:t xml:space="preserve"> </w:t>
+      </w:r>
+      <w:proofErr w:type="spellStart"/>
+      <w:r>
+        <w:rPr>
+          <w:rFonts w:ascii="Times New Roman" w:hAnsi="Times New Roman" w:cs="Times New Roman"/>
+          <w:bCs/>
+          <w:color w:val="000000" w:themeColor="text1"/>
+          <w:sz w:val="28"/>
+          <w:szCs w:val="28"/>
+        </w:rPr>
+        <w:t>chương</w:t>
+      </w:r>
+      <w:proofErr w:type="spellEnd"/>
+      <w:r>
+        <w:rPr>
+          <w:rFonts w:ascii="Times New Roman" w:hAnsi="Times New Roman" w:cs="Times New Roman"/>
+          <w:bCs/>
+          <w:color w:val="000000" w:themeColor="text1"/>
+          <w:sz w:val="28"/>
+          <w:szCs w:val="28"/>
+        </w:rPr>
+        <w:t xml:space="preserve"> </w:t>
+      </w:r>
+      <w:proofErr w:type="spellStart"/>
+      <w:r>
+        <w:rPr>
+          <w:rFonts w:ascii="Times New Roman" w:hAnsi="Times New Roman" w:cs="Times New Roman"/>
+          <w:bCs/>
+          <w:color w:val="000000" w:themeColor="text1"/>
+          <w:sz w:val="28"/>
+          <w:szCs w:val="28"/>
+        </w:rPr>
+        <w:t>trình</w:t>
+      </w:r>
+      <w:proofErr w:type="spellEnd"/>
+      <w:r>
+        <w:rPr>
+          <w:rFonts w:ascii="Times New Roman" w:hAnsi="Times New Roman" w:cs="Times New Roman"/>
+          <w:bCs/>
+          <w:color w:val="000000" w:themeColor="text1"/>
+          <w:sz w:val="28"/>
+          <w:szCs w:val="28"/>
+        </w:rPr>
+        <w:t xml:space="preserve"> </w:t>
+      </w:r>
+      <w:proofErr w:type="spellStart"/>
+      <w:r>
+        <w:rPr>
+          <w:rFonts w:ascii="Times New Roman" w:hAnsi="Times New Roman" w:cs="Times New Roman"/>
+          <w:bCs/>
+          <w:color w:val="000000" w:themeColor="text1"/>
+          <w:sz w:val="28"/>
+          <w:szCs w:val="28"/>
+        </w:rPr>
+        <w:t>nhập</w:t>
+      </w:r>
+      <w:proofErr w:type="spellEnd"/>
+      <w:r>
+        <w:rPr>
+          <w:rFonts w:ascii="Times New Roman" w:hAnsi="Times New Roman" w:cs="Times New Roman"/>
+          <w:bCs/>
+          <w:color w:val="000000" w:themeColor="text1"/>
+          <w:sz w:val="28"/>
+          <w:szCs w:val="28"/>
+        </w:rPr>
+        <w:t xml:space="preserve"> </w:t>
+      </w:r>
+      <w:proofErr w:type="spellStart"/>
+      <w:r>
+        <w:rPr>
+          <w:rFonts w:ascii="Times New Roman" w:hAnsi="Times New Roman" w:cs="Times New Roman"/>
+          <w:bCs/>
+          <w:color w:val="000000" w:themeColor="text1"/>
+          <w:sz w:val="28"/>
+          <w:szCs w:val="28"/>
+        </w:rPr>
+        <w:t>vào</w:t>
+      </w:r>
+      <w:proofErr w:type="spellEnd"/>
+      <w:r>
+        <w:rPr>
+          <w:rFonts w:ascii="Times New Roman" w:hAnsi="Times New Roman" w:cs="Times New Roman"/>
+          <w:bCs/>
+          <w:color w:val="000000" w:themeColor="text1"/>
+          <w:sz w:val="28"/>
+          <w:szCs w:val="28"/>
+        </w:rPr>
+        <w:t xml:space="preserve"> </w:t>
+      </w:r>
+      <w:proofErr w:type="spellStart"/>
+      <w:r>
+        <w:rPr>
+          <w:rFonts w:ascii="Times New Roman" w:hAnsi="Times New Roman" w:cs="Times New Roman"/>
+          <w:bCs/>
+          <w:color w:val="000000" w:themeColor="text1"/>
+          <w:sz w:val="28"/>
+          <w:szCs w:val="28"/>
+        </w:rPr>
+        <w:t>hai</w:t>
+      </w:r>
+      <w:proofErr w:type="spellEnd"/>
+      <w:r>
+        <w:rPr>
+          <w:rFonts w:ascii="Times New Roman" w:hAnsi="Times New Roman" w:cs="Times New Roman"/>
+          <w:bCs/>
+          <w:color w:val="000000" w:themeColor="text1"/>
+          <w:sz w:val="28"/>
+          <w:szCs w:val="28"/>
+        </w:rPr>
+        <w:t xml:space="preserve"> </w:t>
+      </w:r>
+      <w:proofErr w:type="spellStart"/>
+      <w:r>
+        <w:rPr>
+          <w:rFonts w:ascii="Times New Roman" w:hAnsi="Times New Roman" w:cs="Times New Roman"/>
+          <w:bCs/>
+          <w:color w:val="000000" w:themeColor="text1"/>
+          <w:sz w:val="28"/>
+          <w:szCs w:val="28"/>
+        </w:rPr>
+        <w:t>phân</w:t>
+      </w:r>
+      <w:proofErr w:type="spellEnd"/>
+      <w:r>
+        <w:rPr>
+          <w:rFonts w:ascii="Times New Roman" w:hAnsi="Times New Roman" w:cs="Times New Roman"/>
+          <w:bCs/>
+          <w:color w:val="000000" w:themeColor="text1"/>
+          <w:sz w:val="28"/>
+          <w:szCs w:val="28"/>
+        </w:rPr>
+        <w:t xml:space="preserve"> </w:t>
+      </w:r>
+      <w:proofErr w:type="spellStart"/>
+      <w:r>
+        <w:rPr>
+          <w:rFonts w:ascii="Times New Roman" w:hAnsi="Times New Roman" w:cs="Times New Roman"/>
+          <w:bCs/>
+          <w:color w:val="000000" w:themeColor="text1"/>
+          <w:sz w:val="28"/>
+          <w:szCs w:val="28"/>
+        </w:rPr>
+        <w:t>số</w:t>
+      </w:r>
+      <w:proofErr w:type="spellEnd"/>
+      <w:r>
+        <w:rPr>
+          <w:rFonts w:ascii="Times New Roman" w:hAnsi="Times New Roman" w:cs="Times New Roman"/>
+          <w:bCs/>
+          <w:color w:val="000000" w:themeColor="text1"/>
+          <w:sz w:val="28"/>
+          <w:szCs w:val="28"/>
+        </w:rPr>
+        <w:t xml:space="preserve">. </w:t>
+      </w:r>
+      <w:proofErr w:type="spellStart"/>
+      <w:r>
+        <w:rPr>
+          <w:rFonts w:ascii="Times New Roman" w:hAnsi="Times New Roman" w:cs="Times New Roman"/>
+          <w:bCs/>
+          <w:color w:val="000000" w:themeColor="text1"/>
+          <w:sz w:val="28"/>
+          <w:szCs w:val="28"/>
+        </w:rPr>
+        <w:t>Tính</w:t>
+      </w:r>
+      <w:proofErr w:type="spellEnd"/>
+      <w:r>
+        <w:rPr>
+          <w:rFonts w:ascii="Times New Roman" w:hAnsi="Times New Roman" w:cs="Times New Roman"/>
+          <w:bCs/>
+          <w:color w:val="000000" w:themeColor="text1"/>
+          <w:sz w:val="28"/>
+          <w:szCs w:val="28"/>
+        </w:rPr>
+        <w:t xml:space="preserve"> </w:t>
+      </w:r>
+      <w:proofErr w:type="spellStart"/>
+      <w:r>
+        <w:rPr>
+          <w:rFonts w:ascii="Times New Roman" w:hAnsi="Times New Roman" w:cs="Times New Roman"/>
+          <w:bCs/>
+          <w:color w:val="000000" w:themeColor="text1"/>
+          <w:sz w:val="28"/>
+          <w:szCs w:val="28"/>
+        </w:rPr>
+        <w:t>tổng</w:t>
+      </w:r>
+      <w:proofErr w:type="spellEnd"/>
+      <w:r>
+        <w:rPr>
+          <w:rFonts w:ascii="Times New Roman" w:hAnsi="Times New Roman" w:cs="Times New Roman"/>
+          <w:bCs/>
+          <w:color w:val="000000" w:themeColor="text1"/>
+          <w:sz w:val="28"/>
+          <w:szCs w:val="28"/>
+        </w:rPr>
+        <w:t xml:space="preserve">, </w:t>
+      </w:r>
+      <w:proofErr w:type="spellStart"/>
+      <w:r>
+        <w:rPr>
+          <w:rFonts w:ascii="Times New Roman" w:hAnsi="Times New Roman" w:cs="Times New Roman"/>
+          <w:bCs/>
+          <w:color w:val="000000" w:themeColor="text1"/>
+          <w:sz w:val="28"/>
+          <w:szCs w:val="28"/>
+        </w:rPr>
+        <w:t>hiệu</w:t>
+      </w:r>
+      <w:proofErr w:type="spellEnd"/>
+      <w:r>
+        <w:rPr>
+          <w:rFonts w:ascii="Times New Roman" w:hAnsi="Times New Roman" w:cs="Times New Roman"/>
+          <w:bCs/>
+          <w:color w:val="000000" w:themeColor="text1"/>
+          <w:sz w:val="28"/>
+          <w:szCs w:val="28"/>
+        </w:rPr>
+        <w:t xml:space="preserve">, </w:t>
+      </w:r>
+      <w:proofErr w:type="spellStart"/>
+      <w:r>
+        <w:rPr>
+          <w:rFonts w:ascii="Times New Roman" w:hAnsi="Times New Roman" w:cs="Times New Roman"/>
+          <w:bCs/>
+          <w:color w:val="000000" w:themeColor="text1"/>
+          <w:sz w:val="28"/>
+          <w:szCs w:val="28"/>
+        </w:rPr>
+        <w:t>tích</w:t>
+      </w:r>
+      <w:proofErr w:type="spellEnd"/>
+      <w:r>
+        <w:rPr>
+          <w:rFonts w:ascii="Times New Roman" w:hAnsi="Times New Roman" w:cs="Times New Roman"/>
+          <w:bCs/>
+          <w:color w:val="000000" w:themeColor="text1"/>
+          <w:sz w:val="28"/>
+          <w:szCs w:val="28"/>
+        </w:rPr>
+        <w:t xml:space="preserve">, </w:t>
+      </w:r>
+      <w:proofErr w:type="spellStart"/>
+      <w:r>
+        <w:rPr>
+          <w:rFonts w:ascii="Times New Roman" w:hAnsi="Times New Roman" w:cs="Times New Roman"/>
+          <w:bCs/>
+          <w:color w:val="000000" w:themeColor="text1"/>
+          <w:sz w:val="28"/>
+          <w:szCs w:val="28"/>
+        </w:rPr>
+        <w:t>thương</w:t>
+      </w:r>
+      <w:proofErr w:type="spellEnd"/>
+      <w:r>
+        <w:rPr>
+          <w:rFonts w:ascii="Times New Roman" w:hAnsi="Times New Roman" w:cs="Times New Roman"/>
+          <w:bCs/>
+          <w:color w:val="000000" w:themeColor="text1"/>
+          <w:sz w:val="28"/>
+          <w:szCs w:val="28"/>
+        </w:rPr>
+        <w:t xml:space="preserve"> </w:t>
+      </w:r>
+      <w:proofErr w:type="spellStart"/>
+      <w:r>
+        <w:rPr>
+          <w:rFonts w:ascii="Times New Roman" w:hAnsi="Times New Roman" w:cs="Times New Roman"/>
+          <w:bCs/>
+          <w:color w:val="000000" w:themeColor="text1"/>
+          <w:sz w:val="28"/>
+          <w:szCs w:val="28"/>
+        </w:rPr>
+        <w:t>giữa</w:t>
+      </w:r>
+      <w:proofErr w:type="spellEnd"/>
+      <w:r>
+        <w:rPr>
+          <w:rFonts w:ascii="Times New Roman" w:hAnsi="Times New Roman" w:cs="Times New Roman"/>
+          <w:bCs/>
+          <w:color w:val="000000" w:themeColor="text1"/>
+          <w:sz w:val="28"/>
+          <w:szCs w:val="28"/>
+        </w:rPr>
+        <w:t xml:space="preserve"> </w:t>
+      </w:r>
+      <w:proofErr w:type="spellStart"/>
+      <w:r>
+        <w:rPr>
+          <w:rFonts w:ascii="Times New Roman" w:hAnsi="Times New Roman" w:cs="Times New Roman"/>
+          <w:bCs/>
+          <w:color w:val="000000" w:themeColor="text1"/>
+          <w:sz w:val="28"/>
+          <w:szCs w:val="28"/>
+        </w:rPr>
+        <w:t>chúng</w:t>
+      </w:r>
+      <w:proofErr w:type="spellEnd"/>
+      <w:r>
+        <w:rPr>
+          <w:rFonts w:ascii="Times New Roman" w:hAnsi="Times New Roman" w:cs="Times New Roman"/>
+          <w:bCs/>
+          <w:color w:val="000000" w:themeColor="text1"/>
+          <w:sz w:val="28"/>
+          <w:szCs w:val="28"/>
+        </w:rPr>
+        <w:t xml:space="preserve"> </w:t>
+      </w:r>
+      <w:proofErr w:type="spellStart"/>
+      <w:r>
+        <w:rPr>
+          <w:rFonts w:ascii="Times New Roman" w:hAnsi="Times New Roman" w:cs="Times New Roman"/>
+          <w:bCs/>
+          <w:color w:val="000000" w:themeColor="text1"/>
+          <w:sz w:val="28"/>
+          <w:szCs w:val="28"/>
+        </w:rPr>
+        <w:t>và</w:t>
+      </w:r>
+      <w:proofErr w:type="spellEnd"/>
+      <w:r>
+        <w:rPr>
+          <w:rFonts w:ascii="Times New Roman" w:hAnsi="Times New Roman" w:cs="Times New Roman"/>
+          <w:bCs/>
+          <w:color w:val="000000" w:themeColor="text1"/>
+          <w:sz w:val="28"/>
+          <w:szCs w:val="28"/>
+        </w:rPr>
+        <w:t xml:space="preserve"> </w:t>
+      </w:r>
+      <w:proofErr w:type="spellStart"/>
+      <w:r>
+        <w:rPr>
+          <w:rFonts w:ascii="Times New Roman" w:hAnsi="Times New Roman" w:cs="Times New Roman"/>
+          <w:bCs/>
+          <w:color w:val="000000" w:themeColor="text1"/>
+          <w:sz w:val="28"/>
+          <w:szCs w:val="28"/>
+        </w:rPr>
+        <w:t>xuất</w:t>
+      </w:r>
+      <w:proofErr w:type="spellEnd"/>
+      <w:r>
+        <w:rPr>
+          <w:rFonts w:ascii="Times New Roman" w:hAnsi="Times New Roman" w:cs="Times New Roman"/>
+          <w:bCs/>
+          <w:color w:val="000000" w:themeColor="text1"/>
+          <w:sz w:val="28"/>
+          <w:szCs w:val="28"/>
+        </w:rPr>
+        <w:t xml:space="preserve"> </w:t>
+      </w:r>
+      <w:proofErr w:type="spellStart"/>
+      <w:r>
+        <w:rPr>
+          <w:rFonts w:ascii="Times New Roman" w:hAnsi="Times New Roman" w:cs="Times New Roman"/>
+          <w:bCs/>
+          <w:color w:val="000000" w:themeColor="text1"/>
+          <w:sz w:val="28"/>
+          <w:szCs w:val="28"/>
+        </w:rPr>
+        <w:t>kết</w:t>
+      </w:r>
+      <w:proofErr w:type="spellEnd"/>
+      <w:r>
+        <w:rPr>
+          <w:rFonts w:ascii="Times New Roman" w:hAnsi="Times New Roman" w:cs="Times New Roman"/>
+          <w:bCs/>
+          <w:color w:val="000000" w:themeColor="text1"/>
+          <w:sz w:val="28"/>
+          <w:szCs w:val="28"/>
+        </w:rPr>
+        <w:t xml:space="preserve"> </w:t>
+      </w:r>
+      <w:proofErr w:type="spellStart"/>
+      <w:r>
+        <w:rPr>
+          <w:rFonts w:ascii="Times New Roman" w:hAnsi="Times New Roman" w:cs="Times New Roman"/>
+          <w:bCs/>
+          <w:color w:val="000000" w:themeColor="text1"/>
+          <w:sz w:val="28"/>
+          <w:szCs w:val="28"/>
+        </w:rPr>
+        <w:t>quả</w:t>
+      </w:r>
+      <w:proofErr w:type="spellEnd"/>
+      <w:r>
+        <w:rPr>
+          <w:rFonts w:ascii="Times New Roman" w:hAnsi="Times New Roman" w:cs="Times New Roman"/>
+          <w:bCs/>
+          <w:color w:val="000000" w:themeColor="text1"/>
+          <w:sz w:val="28"/>
+          <w:szCs w:val="28"/>
+        </w:rPr>
+        <w:t>.</w:t>
       </w:r>
     </w:p>
     <w:p>
@@ -1866,6 +3453,7 @@
           <w:szCs w:val="28"/>
         </w:rPr>
       </w:pPr>
+      <w:proofErr w:type="spellStart"/>
       <w:r>
         <w:rPr>
           <w:rFonts w:ascii="Times New Roman" w:hAnsi="Times New Roman" w:cs="Times New Roman"/>
@@ -1875,17 +3463,373 @@
           <w:sz w:val="28"/>
           <w:szCs w:val="28"/>
         </w:rPr>
-        <w:t xml:space="preserve">Bài tập 4: </w:t>
-      </w:r>
-      <w:r>
-        <w:rPr>
-          <w:rFonts w:ascii="Times New Roman" w:hAnsi="Times New Roman" w:cs="Times New Roman"/>
-          <w:bCs/>
-          <w:color w:val="000000" w:themeColor="text1"/>
-          <w:sz w:val="28"/>
-          <w:szCs w:val="28"/>
-        </w:rPr>
-        <w:t>Viết chương trình nhập vào một ngày. Tìm ngày kế tiếp và xuất kết quả.</w:t>
+        <w:t>Bài</w:t>
+      </w:r>
+      <w:proofErr w:type="spellEnd"/>
+      <w:r>
+        <w:rPr>
+          <w:rFonts w:ascii="Times New Roman" w:hAnsi="Times New Roman" w:cs="Times New Roman"/>
+          <w:b/>
+          <w:bCs/>
+          <w:color w:val="000000" w:themeColor="text1"/>
+          <w:sz w:val="28"/>
+          <w:szCs w:val="28"/>
+        </w:rPr>
+        <w:t xml:space="preserve"> </w:t>
+      </w:r>
+      <w:proofErr w:type="spellStart"/>
+      <w:r>
+        <w:rPr>
+          <w:rFonts w:ascii="Times New Roman" w:hAnsi="Times New Roman" w:cs="Times New Roman"/>
+          <w:b/>
+          <w:bCs/>
+          <w:color w:val="000000" w:themeColor="text1"/>
+          <w:sz w:val="28"/>
+          <w:szCs w:val="28"/>
+        </w:rPr>
+        <w:t>tập</w:t>
+      </w:r>
+      <w:proofErr w:type="spellEnd"/>
+      <w:r>
+        <w:rPr>
+          <w:rFonts w:ascii="Times New Roman" w:hAnsi="Times New Roman" w:cs="Times New Roman"/>
+          <w:b/>
+          <w:bCs/>
+          <w:color w:val="000000" w:themeColor="text1"/>
+          <w:sz w:val="28"/>
+          <w:szCs w:val="28"/>
+        </w:rPr>
+        <w:t xml:space="preserve"> 4: </w:t>
+      </w:r>
+      <w:proofErr w:type="spellStart"/>
+      <w:r>
+        <w:rPr>
+          <w:rFonts w:ascii="Times New Roman" w:hAnsi="Times New Roman" w:cs="Times New Roman"/>
+          <w:bCs/>
+          <w:color w:val="000000" w:themeColor="text1"/>
+          <w:sz w:val="28"/>
+          <w:szCs w:val="28"/>
+        </w:rPr>
+        <w:t>Viết</w:t>
+      </w:r>
+      <w:proofErr w:type="spellEnd"/>
+      <w:r>
+        <w:rPr>
+          <w:rFonts w:ascii="Times New Roman" w:hAnsi="Times New Roman" w:cs="Times New Roman"/>
+          <w:bCs/>
+          <w:color w:val="000000" w:themeColor="text1"/>
+          <w:sz w:val="28"/>
+          <w:szCs w:val="28"/>
+        </w:rPr>
+        <w:t xml:space="preserve"> </w:t>
+      </w:r>
+      <w:proofErr w:type="spellStart"/>
+      <w:r>
+        <w:rPr>
+          <w:rFonts w:ascii="Times New Roman" w:hAnsi="Times New Roman" w:cs="Times New Roman"/>
+          <w:bCs/>
+          <w:color w:val="000000" w:themeColor="text1"/>
+          <w:sz w:val="28"/>
+          <w:szCs w:val="28"/>
+        </w:rPr>
+        <w:t>chương</w:t>
+      </w:r>
+      <w:proofErr w:type="spellEnd"/>
+      <w:r>
+        <w:rPr>
+          <w:rFonts w:ascii="Times New Roman" w:hAnsi="Times New Roman" w:cs="Times New Roman"/>
+          <w:bCs/>
+          <w:color w:val="000000" w:themeColor="text1"/>
+          <w:sz w:val="28"/>
+          <w:szCs w:val="28"/>
+        </w:rPr>
+        <w:t xml:space="preserve"> </w:t>
+      </w:r>
+      <w:proofErr w:type="spellStart"/>
+      <w:r>
+        <w:rPr>
+          <w:rFonts w:ascii="Times New Roman" w:hAnsi="Times New Roman" w:cs="Times New Roman"/>
+          <w:bCs/>
+          <w:color w:val="000000" w:themeColor="text1"/>
+          <w:sz w:val="28"/>
+          <w:szCs w:val="28"/>
+        </w:rPr>
+        <w:t>trình</w:t>
+      </w:r>
+      <w:proofErr w:type="spellEnd"/>
+      <w:r>
+        <w:rPr>
+          <w:rFonts w:ascii="Times New Roman" w:hAnsi="Times New Roman" w:cs="Times New Roman"/>
+          <w:bCs/>
+          <w:color w:val="000000" w:themeColor="text1"/>
+          <w:sz w:val="28"/>
+          <w:szCs w:val="28"/>
+        </w:rPr>
+        <w:t xml:space="preserve"> </w:t>
+      </w:r>
+      <w:proofErr w:type="spellStart"/>
+      <w:r>
+        <w:rPr>
+          <w:rFonts w:ascii="Times New Roman" w:hAnsi="Times New Roman" w:cs="Times New Roman"/>
+          <w:bCs/>
+          <w:color w:val="000000" w:themeColor="text1"/>
+          <w:sz w:val="28"/>
+          <w:szCs w:val="28"/>
+        </w:rPr>
+        <w:t>nhập</w:t>
+      </w:r>
+      <w:proofErr w:type="spellEnd"/>
+      <w:r>
+        <w:rPr>
+          <w:rFonts w:ascii="Times New Roman" w:hAnsi="Times New Roman" w:cs="Times New Roman"/>
+          <w:bCs/>
+          <w:color w:val="000000" w:themeColor="text1"/>
+          <w:sz w:val="28"/>
+          <w:szCs w:val="28"/>
+        </w:rPr>
+        <w:t xml:space="preserve"> </w:t>
+      </w:r>
+      <w:proofErr w:type="spellStart"/>
+      <w:r>
+        <w:rPr>
+          <w:rFonts w:ascii="Times New Roman" w:hAnsi="Times New Roman" w:cs="Times New Roman"/>
+          <w:bCs/>
+          <w:color w:val="000000" w:themeColor="text1"/>
+          <w:sz w:val="28"/>
+          <w:szCs w:val="28"/>
+        </w:rPr>
+        <w:t>vào</w:t>
+      </w:r>
+      <w:proofErr w:type="spellEnd"/>
+      <w:r>
+        <w:rPr>
+          <w:rFonts w:ascii="Times New Roman" w:hAnsi="Times New Roman" w:cs="Times New Roman"/>
+          <w:bCs/>
+          <w:color w:val="000000" w:themeColor="text1"/>
+          <w:sz w:val="28"/>
+          <w:szCs w:val="28"/>
+        </w:rPr>
+        <w:t xml:space="preserve"> </w:t>
+      </w:r>
+      <w:proofErr w:type="spellStart"/>
+      <w:r>
+        <w:rPr>
+          <w:rFonts w:ascii="Times New Roman" w:hAnsi="Times New Roman" w:cs="Times New Roman"/>
+          <w:bCs/>
+          <w:color w:val="000000" w:themeColor="text1"/>
+          <w:sz w:val="28"/>
+          <w:szCs w:val="28"/>
+        </w:rPr>
+        <w:t>một</w:t>
+      </w:r>
+      <w:proofErr w:type="spellEnd"/>
+      <w:r>
+        <w:rPr>
+          <w:rFonts w:ascii="Times New Roman" w:hAnsi="Times New Roman" w:cs="Times New Roman"/>
+          <w:bCs/>
+          <w:color w:val="000000" w:themeColor="text1"/>
+          <w:sz w:val="28"/>
+          <w:szCs w:val="28"/>
+        </w:rPr>
+        <w:t xml:space="preserve"> </w:t>
+      </w:r>
+      <w:proofErr w:type="spellStart"/>
+      <w:r>
+        <w:rPr>
+          <w:rFonts w:ascii="Times New Roman" w:hAnsi="Times New Roman" w:cs="Times New Roman"/>
+          <w:bCs/>
+          <w:color w:val="000000" w:themeColor="text1"/>
+          <w:sz w:val="28"/>
+          <w:szCs w:val="28"/>
+        </w:rPr>
+        <w:t>ngày</w:t>
+      </w:r>
+      <w:proofErr w:type="spellEnd"/>
+      <w:r>
+        <w:rPr>
+          <w:rFonts w:ascii="Times New Roman" w:hAnsi="Times New Roman" w:cs="Times New Roman"/>
+          <w:bCs/>
+          <w:color w:val="000000" w:themeColor="text1"/>
+          <w:sz w:val="28"/>
+          <w:szCs w:val="28"/>
+        </w:rPr>
+        <w:t xml:space="preserve">. </w:t>
+      </w:r>
+      <w:proofErr w:type="spellStart"/>
+      <w:r>
+        <w:rPr>
+          <w:rFonts w:ascii="Times New Roman" w:hAnsi="Times New Roman" w:cs="Times New Roman"/>
+          <w:bCs/>
+          <w:color w:val="000000" w:themeColor="text1"/>
+          <w:sz w:val="28"/>
+          <w:szCs w:val="28"/>
+        </w:rPr>
+        <w:t>Tìm</w:t>
+      </w:r>
+      <w:proofErr w:type="spellEnd"/>
+      <w:r>
+        <w:rPr>
+          <w:rFonts w:ascii="Times New Roman" w:hAnsi="Times New Roman" w:cs="Times New Roman"/>
+          <w:bCs/>
+          <w:color w:val="000000" w:themeColor="text1"/>
+          <w:sz w:val="28"/>
+          <w:szCs w:val="28"/>
+        </w:rPr>
+        <w:t xml:space="preserve"> </w:t>
+      </w:r>
+      <w:proofErr w:type="spellStart"/>
+      <w:r>
+        <w:rPr>
+          <w:rFonts w:ascii="Times New Roman" w:hAnsi="Times New Roman" w:cs="Times New Roman"/>
+          <w:bCs/>
+          <w:color w:val="000000" w:themeColor="text1"/>
+          <w:sz w:val="28"/>
+          <w:szCs w:val="28"/>
+        </w:rPr>
+        <w:t>ngày</w:t>
+      </w:r>
+      <w:proofErr w:type="spellEnd"/>
+      <w:r>
+        <w:rPr>
+          <w:rFonts w:ascii="Times New Roman" w:hAnsi="Times New Roman" w:cs="Times New Roman"/>
+          <w:bCs/>
+          <w:color w:val="000000" w:themeColor="text1"/>
+          <w:sz w:val="28"/>
+          <w:szCs w:val="28"/>
+        </w:rPr>
+        <w:t xml:space="preserve"> </w:t>
+      </w:r>
+      <w:proofErr w:type="spellStart"/>
+      <w:r>
+        <w:rPr>
+          <w:rFonts w:ascii="Times New Roman" w:hAnsi="Times New Roman" w:cs="Times New Roman"/>
+          <w:bCs/>
+          <w:color w:val="000000" w:themeColor="text1"/>
+          <w:sz w:val="28"/>
+          <w:szCs w:val="28"/>
+        </w:rPr>
+        <w:t>kế</w:t>
+      </w:r>
+      <w:proofErr w:type="spellEnd"/>
+      <w:r>
+        <w:rPr>
+          <w:rFonts w:ascii="Times New Roman" w:hAnsi="Times New Roman" w:cs="Times New Roman"/>
+          <w:bCs/>
+          <w:color w:val="000000" w:themeColor="text1"/>
+          <w:sz w:val="28"/>
+          <w:szCs w:val="28"/>
+        </w:rPr>
+        <w:t xml:space="preserve"> </w:t>
+      </w:r>
+      <w:proofErr w:type="spellStart"/>
+      <w:r>
+        <w:rPr>
+          <w:rFonts w:ascii="Times New Roman" w:hAnsi="Times New Roman" w:cs="Times New Roman"/>
+          <w:bCs/>
+          <w:color w:val="000000" w:themeColor="text1"/>
+          <w:sz w:val="28"/>
+          <w:szCs w:val="28"/>
+        </w:rPr>
+        <w:t>tiếp</w:t>
+      </w:r>
+      <w:proofErr w:type="spellEnd"/>
+      <w:r>
+        <w:rPr>
+          <w:rFonts w:ascii="Times New Roman" w:hAnsi="Times New Roman" w:cs="Times New Roman"/>
+          <w:bCs/>
+          <w:color w:val="000000" w:themeColor="text1"/>
+          <w:sz w:val="28"/>
+          <w:szCs w:val="28"/>
+        </w:rPr>
+        <w:t xml:space="preserve"> </w:t>
+      </w:r>
+      <w:proofErr w:type="spellStart"/>
+      <w:r>
+        <w:rPr>
+          <w:rFonts w:ascii="Times New Roman" w:hAnsi="Times New Roman" w:cs="Times New Roman"/>
+          <w:bCs/>
+          <w:color w:val="000000" w:themeColor="text1"/>
+          <w:sz w:val="28"/>
+          <w:szCs w:val="28"/>
+        </w:rPr>
+        <w:t>và</w:t>
+      </w:r>
+      <w:proofErr w:type="spellEnd"/>
+      <w:r>
+        <w:rPr>
+          <w:rFonts w:ascii="Times New Roman" w:hAnsi="Times New Roman" w:cs="Times New Roman"/>
+          <w:bCs/>
+          <w:color w:val="000000" w:themeColor="text1"/>
+          <w:sz w:val="28"/>
+          <w:szCs w:val="28"/>
+        </w:rPr>
+        <w:t xml:space="preserve"> </w:t>
+      </w:r>
+      <w:proofErr w:type="spellStart"/>
+      <w:r>
+        <w:rPr>
+          <w:rFonts w:ascii="Times New Roman" w:hAnsi="Times New Roman" w:cs="Times New Roman"/>
+          <w:bCs/>
+          <w:color w:val="000000" w:themeColor="text1"/>
+          <w:sz w:val="28"/>
+          <w:szCs w:val="28"/>
+        </w:rPr>
+        <w:t>xuất</w:t>
+      </w:r>
+      <w:proofErr w:type="spellEnd"/>
+      <w:r>
+        <w:rPr>
+          <w:rFonts w:ascii="Times New Roman" w:hAnsi="Times New Roman" w:cs="Times New Roman"/>
+          <w:bCs/>
+          <w:color w:val="000000" w:themeColor="text1"/>
+          <w:sz w:val="28"/>
+          <w:szCs w:val="28"/>
+        </w:rPr>
+        <w:t xml:space="preserve"> </w:t>
+      </w:r>
+      <w:proofErr w:type="spellStart"/>
+      <w:r>
+        <w:rPr>
+          <w:rFonts w:ascii="Times New Roman" w:hAnsi="Times New Roman" w:cs="Times New Roman"/>
+          <w:bCs/>
+          <w:color w:val="000000" w:themeColor="text1"/>
+          <w:sz w:val="28"/>
+          <w:szCs w:val="28"/>
+        </w:rPr>
+        <w:t>kết</w:t>
+      </w:r>
+      <w:proofErr w:type="spellEnd"/>
+      <w:r>
+        <w:rPr>
+          <w:rFonts w:ascii="Times New Roman" w:hAnsi="Times New Roman" w:cs="Times New Roman"/>
+          <w:bCs/>
+          <w:color w:val="000000" w:themeColor="text1"/>
+          <w:sz w:val="28"/>
+          <w:szCs w:val="28"/>
+        </w:rPr>
+        <w:t xml:space="preserve"> </w:t>
+      </w:r>
+      <w:proofErr w:type="spellStart"/>
+      <w:r>
+        <w:rPr>
+          <w:rFonts w:ascii="Times New Roman" w:hAnsi="Times New Roman" w:cs="Times New Roman"/>
+          <w:bCs/>
+          <w:color w:val="000000" w:themeColor="text1"/>
+          <w:sz w:val="28"/>
+          <w:szCs w:val="28"/>
+        </w:rPr>
+        <w:t>quả</w:t>
+      </w:r>
+      <w:proofErr w:type="spellEnd"/>
+      <w:r>
+        <w:rPr>
+          <w:rFonts w:ascii="Times New Roman" w:hAnsi="Times New Roman" w:cs="Times New Roman"/>
+          <w:bCs/>
+          <w:color w:val="000000" w:themeColor="text1"/>
+          <w:sz w:val="28"/>
+          <w:szCs w:val="28"/>
+        </w:rPr>
+        <w:t>.</w:t>
       </w:r>
     </w:p>
     <w:p>
@@ -1899,6 +3843,7 @@
           <w:szCs w:val="28"/>
         </w:rPr>
       </w:pPr>
+      <w:proofErr w:type="spellStart"/>
       <w:r>
         <w:rPr>
           <w:rFonts w:ascii="Times New Roman" w:hAnsi="Times New Roman" w:cs="Times New Roman"/>
@@ -1908,18 +3853,518 @@
           <w:sz w:val="28"/>
           <w:szCs w:val="28"/>
         </w:rPr>
-        <w:t xml:space="preserve">Bài tập 5: </w:t>
-      </w:r>
-      <w:r>
-        <w:rPr>
-          <w:rFonts w:ascii="Times New Roman" w:hAnsi="Times New Roman" w:cs="Times New Roman"/>
-          <w:bCs/>
-          <w:color w:val="000000" w:themeColor="text1"/>
-          <w:sz w:val="28"/>
-          <w:szCs w:val="28"/>
-        </w:rPr>
-        <w:t>Viết chương trình nhập họ tên, điểm toán, điểm văn của một học sinh. Tính điểm trung bình và xuất kết quả</w:t>
-      </w:r>
+        <w:t>Bài</w:t>
+      </w:r>
+      <w:proofErr w:type="spellEnd"/>
+      <w:r>
+        <w:rPr>
+          <w:rFonts w:ascii="Times New Roman" w:hAnsi="Times New Roman" w:cs="Times New Roman"/>
+          <w:b/>
+          <w:bCs/>
+          <w:color w:val="000000" w:themeColor="text1"/>
+          <w:sz w:val="28"/>
+          <w:szCs w:val="28"/>
+        </w:rPr>
+        <w:t xml:space="preserve"> </w:t>
+      </w:r>
+      <w:proofErr w:type="spellStart"/>
+      <w:r>
+        <w:rPr>
+          <w:rFonts w:ascii="Times New Roman" w:hAnsi="Times New Roman" w:cs="Times New Roman"/>
+          <w:b/>
+          <w:bCs/>
+          <w:color w:val="000000" w:themeColor="text1"/>
+          <w:sz w:val="28"/>
+          <w:szCs w:val="28"/>
+        </w:rPr>
+        <w:t>tập</w:t>
+      </w:r>
+      <w:proofErr w:type="spellEnd"/>
+      <w:r>
+        <w:rPr>
+          <w:rFonts w:ascii="Times New Roman" w:hAnsi="Times New Roman" w:cs="Times New Roman"/>
+          <w:b/>
+          <w:bCs/>
+          <w:color w:val="000000" w:themeColor="text1"/>
+          <w:sz w:val="28"/>
+          <w:szCs w:val="28"/>
+        </w:rPr>
+        <w:t xml:space="preserve"> 5: </w:t>
+      </w:r>
+      <w:proofErr w:type="spellStart"/>
+      <w:r>
+        <w:rPr>
+          <w:rFonts w:ascii="Times New Roman" w:hAnsi="Times New Roman" w:cs="Times New Roman"/>
+          <w:bCs/>
+          <w:color w:val="000000" w:themeColor="text1"/>
+          <w:sz w:val="28"/>
+          <w:szCs w:val="28"/>
+        </w:rPr>
+        <w:t>Viết</w:t>
+      </w:r>
+      <w:proofErr w:type="spellEnd"/>
+      <w:r>
+        <w:rPr>
+          <w:rFonts w:ascii="Times New Roman" w:hAnsi="Times New Roman" w:cs="Times New Roman"/>
+          <w:bCs/>
+          <w:color w:val="000000" w:themeColor="text1"/>
+          <w:sz w:val="28"/>
+          <w:szCs w:val="28"/>
+        </w:rPr>
+        <w:t xml:space="preserve"> </w:t>
+      </w:r>
+      <w:proofErr w:type="spellStart"/>
+      <w:r>
+        <w:rPr>
+          <w:rFonts w:ascii="Times New Roman" w:hAnsi="Times New Roman" w:cs="Times New Roman"/>
+          <w:bCs/>
+          <w:color w:val="000000" w:themeColor="text1"/>
+          <w:sz w:val="28"/>
+          <w:szCs w:val="28"/>
+        </w:rPr>
+        <w:t>chương</w:t>
+      </w:r>
+      <w:proofErr w:type="spellEnd"/>
+      <w:r>
+        <w:rPr>
+          <w:rFonts w:ascii="Times New Roman" w:hAnsi="Times New Roman" w:cs="Times New Roman"/>
+          <w:bCs/>
+          <w:color w:val="000000" w:themeColor="text1"/>
+          <w:sz w:val="28"/>
+          <w:szCs w:val="28"/>
+        </w:rPr>
+        <w:t xml:space="preserve"> </w:t>
+      </w:r>
+      <w:proofErr w:type="spellStart"/>
+      <w:r>
+        <w:rPr>
+          <w:rFonts w:ascii="Times New Roman" w:hAnsi="Times New Roman" w:cs="Times New Roman"/>
+          <w:bCs/>
+          <w:color w:val="000000" w:themeColor="text1"/>
+          <w:sz w:val="28"/>
+          <w:szCs w:val="28"/>
+        </w:rPr>
+        <w:t>trình</w:t>
+      </w:r>
+      <w:proofErr w:type="spellEnd"/>
+      <w:r>
+        <w:rPr>
+          <w:rFonts w:ascii="Times New Roman" w:hAnsi="Times New Roman" w:cs="Times New Roman"/>
+          <w:bCs/>
+          <w:color w:val="000000" w:themeColor="text1"/>
+          <w:sz w:val="28"/>
+          <w:szCs w:val="28"/>
+        </w:rPr>
+        <w:t xml:space="preserve"> </w:t>
+      </w:r>
+      <w:proofErr w:type="spellStart"/>
+      <w:r>
+        <w:rPr>
+          <w:rFonts w:ascii="Times New Roman" w:hAnsi="Times New Roman" w:cs="Times New Roman"/>
+          <w:bCs/>
+          <w:color w:val="000000" w:themeColor="text1"/>
+          <w:sz w:val="28"/>
+          <w:szCs w:val="28"/>
+        </w:rPr>
+        <w:t>nhập</w:t>
+      </w:r>
+      <w:proofErr w:type="spellEnd"/>
+      <w:r>
+        <w:rPr>
+          <w:rFonts w:ascii="Times New Roman" w:hAnsi="Times New Roman" w:cs="Times New Roman"/>
+          <w:bCs/>
+          <w:color w:val="000000" w:themeColor="text1"/>
+          <w:sz w:val="28"/>
+          <w:szCs w:val="28"/>
+        </w:rPr>
+        <w:t xml:space="preserve"> </w:t>
+      </w:r>
+      <w:proofErr w:type="spellStart"/>
+      <w:r>
+        <w:rPr>
+          <w:rFonts w:ascii="Times New Roman" w:hAnsi="Times New Roman" w:cs="Times New Roman"/>
+          <w:bCs/>
+          <w:color w:val="000000" w:themeColor="text1"/>
+          <w:sz w:val="28"/>
+          <w:szCs w:val="28"/>
+        </w:rPr>
+        <w:t>họ</w:t>
+      </w:r>
+      <w:proofErr w:type="spellEnd"/>
+      <w:r>
+        <w:rPr>
+          <w:rFonts w:ascii="Times New Roman" w:hAnsi="Times New Roman" w:cs="Times New Roman"/>
+          <w:bCs/>
+          <w:color w:val="000000" w:themeColor="text1"/>
+          <w:sz w:val="28"/>
+          <w:szCs w:val="28"/>
+        </w:rPr>
+        <w:t xml:space="preserve"> </w:t>
+      </w:r>
+      <w:proofErr w:type="spellStart"/>
+      <w:r>
+        <w:rPr>
+          <w:rFonts w:ascii="Times New Roman" w:hAnsi="Times New Roman" w:cs="Times New Roman"/>
+          <w:bCs/>
+          <w:color w:val="000000" w:themeColor="text1"/>
+          <w:sz w:val="28"/>
+          <w:szCs w:val="28"/>
+        </w:rPr>
+        <w:t>tên</w:t>
+      </w:r>
+      <w:proofErr w:type="spellEnd"/>
+      <w:r>
+        <w:rPr>
+          <w:rFonts w:ascii="Times New Roman" w:hAnsi="Times New Roman" w:cs="Times New Roman"/>
+          <w:bCs/>
+          <w:color w:val="000000" w:themeColor="text1"/>
+          <w:sz w:val="28"/>
+          <w:szCs w:val="28"/>
+        </w:rPr>
+        <w:t xml:space="preserve">, </w:t>
+      </w:r>
+      <w:proofErr w:type="spellStart"/>
+      <w:r>
+        <w:rPr>
+          <w:rFonts w:ascii="Times New Roman" w:hAnsi="Times New Roman" w:cs="Times New Roman"/>
+          <w:bCs/>
+          <w:color w:val="000000" w:themeColor="text1"/>
+          <w:sz w:val="28"/>
+          <w:szCs w:val="28"/>
+        </w:rPr>
+        <w:t>điểm</w:t>
+      </w:r>
+      <w:proofErr w:type="spellEnd"/>
+      <w:r>
+        <w:rPr>
+          <w:rFonts w:ascii="Times New Roman" w:hAnsi="Times New Roman" w:cs="Times New Roman"/>
+          <w:bCs/>
+          <w:color w:val="000000" w:themeColor="text1"/>
+          <w:sz w:val="28"/>
+          <w:szCs w:val="28"/>
+        </w:rPr>
+        <w:t xml:space="preserve"> </w:t>
+      </w:r>
+      <w:proofErr w:type="spellStart"/>
+      <w:r>
+        <w:rPr>
+          <w:rFonts w:ascii="Times New Roman" w:hAnsi="Times New Roman" w:cs="Times New Roman"/>
+          <w:bCs/>
+          <w:color w:val="000000" w:themeColor="text1"/>
+          <w:sz w:val="28"/>
+          <w:szCs w:val="28"/>
+        </w:rPr>
+        <w:t>toán</w:t>
+      </w:r>
+      <w:proofErr w:type="spellEnd"/>
+      <w:r>
+        <w:rPr>
+          <w:rFonts w:ascii="Times New Roman" w:hAnsi="Times New Roman" w:cs="Times New Roman"/>
+          <w:bCs/>
+          <w:color w:val="000000" w:themeColor="text1"/>
+          <w:sz w:val="28"/>
+          <w:szCs w:val="28"/>
+        </w:rPr>
+        <w:t xml:space="preserve">, </w:t>
+      </w:r>
+      <w:proofErr w:type="spellStart"/>
+      <w:r>
+        <w:rPr>
+          <w:rFonts w:ascii="Times New Roman" w:hAnsi="Times New Roman" w:cs="Times New Roman"/>
+          <w:bCs/>
+          <w:color w:val="000000" w:themeColor="text1"/>
+          <w:sz w:val="28"/>
+          <w:szCs w:val="28"/>
+        </w:rPr>
+        <w:t>điểm</w:t>
+      </w:r>
+      <w:proofErr w:type="spellEnd"/>
+      <w:r>
+        <w:rPr>
+          <w:rFonts w:ascii="Times New Roman" w:hAnsi="Times New Roman" w:cs="Times New Roman"/>
+          <w:bCs/>
+          <w:color w:val="000000" w:themeColor="text1"/>
+          <w:sz w:val="28"/>
+          <w:szCs w:val="28"/>
+        </w:rPr>
+        <w:t xml:space="preserve"> </w:t>
+      </w:r>
+      <w:proofErr w:type="spellStart"/>
+      <w:r>
+        <w:rPr>
+          <w:rFonts w:ascii="Times New Roman" w:hAnsi="Times New Roman" w:cs="Times New Roman"/>
+          <w:bCs/>
+          <w:color w:val="000000" w:themeColor="text1"/>
+          <w:sz w:val="28"/>
+          <w:szCs w:val="28"/>
+        </w:rPr>
+        <w:t>văn</w:t>
+      </w:r>
+      <w:proofErr w:type="spellEnd"/>
+      <w:r>
+        <w:rPr>
+          <w:rFonts w:ascii="Times New Roman" w:hAnsi="Times New Roman" w:cs="Times New Roman"/>
+          <w:bCs/>
+          <w:color w:val="000000" w:themeColor="text1"/>
+          <w:sz w:val="28"/>
+          <w:szCs w:val="28"/>
+        </w:rPr>
+        <w:t xml:space="preserve"> </w:t>
+      </w:r>
+      <w:proofErr w:type="spellStart"/>
+      <w:r>
+        <w:rPr>
+          <w:rFonts w:ascii="Times New Roman" w:hAnsi="Times New Roman" w:cs="Times New Roman"/>
+          <w:bCs/>
+          <w:color w:val="000000" w:themeColor="text1"/>
+          <w:sz w:val="28"/>
+          <w:szCs w:val="28"/>
+        </w:rPr>
+        <w:t>của</w:t>
+      </w:r>
+      <w:proofErr w:type="spellEnd"/>
+      <w:r>
+        <w:rPr>
+          <w:rFonts w:ascii="Times New Roman" w:hAnsi="Times New Roman" w:cs="Times New Roman"/>
+          <w:bCs/>
+          <w:color w:val="000000" w:themeColor="text1"/>
+          <w:sz w:val="28"/>
+          <w:szCs w:val="28"/>
+        </w:rPr>
+        <w:t xml:space="preserve"> </w:t>
+      </w:r>
+      <w:proofErr w:type="spellStart"/>
+      <w:r>
+        <w:rPr>
+          <w:rFonts w:ascii="Times New Roman" w:hAnsi="Times New Roman" w:cs="Times New Roman"/>
+          <w:bCs/>
+          <w:color w:val="000000" w:themeColor="text1"/>
+          <w:sz w:val="28"/>
+          <w:szCs w:val="28"/>
+        </w:rPr>
+        <w:t>một</w:t>
+      </w:r>
+      <w:proofErr w:type="spellEnd"/>
+      <w:r>
+        <w:rPr>
+          <w:rFonts w:ascii="Times New Roman" w:hAnsi="Times New Roman" w:cs="Times New Roman"/>
+          <w:bCs/>
+          <w:color w:val="000000" w:themeColor="text1"/>
+          <w:sz w:val="28"/>
+          <w:szCs w:val="28"/>
+        </w:rPr>
+        <w:t xml:space="preserve"> </w:t>
+      </w:r>
+      <w:proofErr w:type="spellStart"/>
+      <w:r>
+        <w:rPr>
+          <w:rFonts w:ascii="Times New Roman" w:hAnsi="Times New Roman" w:cs="Times New Roman"/>
+          <w:bCs/>
+          <w:color w:val="000000" w:themeColor="text1"/>
+          <w:sz w:val="28"/>
+          <w:szCs w:val="28"/>
+        </w:rPr>
+        <w:t>học</w:t>
+      </w:r>
+      <w:proofErr w:type="spellEnd"/>
+      <w:r>
+        <w:rPr>
+          <w:rFonts w:ascii="Times New Roman" w:hAnsi="Times New Roman" w:cs="Times New Roman"/>
+          <w:bCs/>
+          <w:color w:val="000000" w:themeColor="text1"/>
+          <w:sz w:val="28"/>
+          <w:szCs w:val="28"/>
+        </w:rPr>
+        <w:t xml:space="preserve"> </w:t>
+      </w:r>
+      <w:proofErr w:type="spellStart"/>
+      <w:r>
+        <w:rPr>
+          <w:rFonts w:ascii="Times New Roman" w:hAnsi="Times New Roman" w:cs="Times New Roman"/>
+          <w:bCs/>
+          <w:color w:val="000000" w:themeColor="text1"/>
+          <w:sz w:val="28"/>
+          <w:szCs w:val="28"/>
+        </w:rPr>
+        <w:t>sinh</w:t>
+      </w:r>
+      <w:proofErr w:type="spellEnd"/>
+      <w:r>
+        <w:rPr>
+          <w:rFonts w:ascii="Times New Roman" w:hAnsi="Times New Roman" w:cs="Times New Roman"/>
+          <w:bCs/>
+          <w:color w:val="000000" w:themeColor="text1"/>
+          <w:sz w:val="28"/>
+          <w:szCs w:val="28"/>
+        </w:rPr>
+        <w:t xml:space="preserve">. </w:t>
+      </w:r>
+      <w:proofErr w:type="spellStart"/>
+      <w:r>
+        <w:rPr>
+          <w:rFonts w:ascii="Times New Roman" w:hAnsi="Times New Roman" w:cs="Times New Roman"/>
+          <w:bCs/>
+          <w:color w:val="000000" w:themeColor="text1"/>
+          <w:sz w:val="28"/>
+          <w:szCs w:val="28"/>
+        </w:rPr>
+        <w:t>Tính</w:t>
+      </w:r>
+      <w:proofErr w:type="spellEnd"/>
+      <w:r>
+        <w:rPr>
+          <w:rFonts w:ascii="Times New Roman" w:hAnsi="Times New Roman" w:cs="Times New Roman"/>
+          <w:bCs/>
+          <w:color w:val="000000" w:themeColor="text1"/>
+          <w:sz w:val="28"/>
+          <w:szCs w:val="28"/>
+        </w:rPr>
+        <w:t xml:space="preserve"> </w:t>
+      </w:r>
+      <w:proofErr w:type="spellStart"/>
+      <w:r>
+        <w:rPr>
+          <w:rFonts w:ascii="Times New Roman" w:hAnsi="Times New Roman" w:cs="Times New Roman"/>
+          <w:bCs/>
+          <w:color w:val="000000" w:themeColor="text1"/>
+          <w:sz w:val="28"/>
+          <w:szCs w:val="28"/>
+        </w:rPr>
+        <w:t>điểm</w:t>
+      </w:r>
+      <w:proofErr w:type="spellEnd"/>
+      <w:r>
+        <w:rPr>
+          <w:rFonts w:ascii="Times New Roman" w:hAnsi="Times New Roman" w:cs="Times New Roman"/>
+          <w:bCs/>
+          <w:color w:val="000000" w:themeColor="text1"/>
+          <w:sz w:val="28"/>
+          <w:szCs w:val="28"/>
+        </w:rPr>
+        <w:t xml:space="preserve"> </w:t>
+      </w:r>
+      <w:proofErr w:type="spellStart"/>
+      <w:r>
+        <w:rPr>
+          <w:rFonts w:ascii="Times New Roman" w:hAnsi="Times New Roman" w:cs="Times New Roman"/>
+          <w:bCs/>
+          <w:color w:val="000000" w:themeColor="text1"/>
+          <w:sz w:val="28"/>
+          <w:szCs w:val="28"/>
+        </w:rPr>
+        <w:t>trung</w:t>
+      </w:r>
+      <w:proofErr w:type="spellEnd"/>
+      <w:r>
+        <w:rPr>
+          <w:rFonts w:ascii="Times New Roman" w:hAnsi="Times New Roman" w:cs="Times New Roman"/>
+          <w:bCs/>
+          <w:color w:val="000000" w:themeColor="text1"/>
+          <w:sz w:val="28"/>
+          <w:szCs w:val="28"/>
+        </w:rPr>
+        <w:t xml:space="preserve"> </w:t>
+      </w:r>
+      <w:proofErr w:type="spellStart"/>
+      <w:r>
+        <w:rPr>
+          <w:rFonts w:ascii="Times New Roman" w:hAnsi="Times New Roman" w:cs="Times New Roman"/>
+          <w:bCs/>
+          <w:color w:val="000000" w:themeColor="text1"/>
+          <w:sz w:val="28"/>
+          <w:szCs w:val="28"/>
+        </w:rPr>
+        <w:t>bình</w:t>
+      </w:r>
+      <w:proofErr w:type="spellEnd"/>
+      <w:r>
+        <w:rPr>
+          <w:rFonts w:ascii="Times New Roman" w:hAnsi="Times New Roman" w:cs="Times New Roman"/>
+          <w:bCs/>
+          <w:color w:val="000000" w:themeColor="text1"/>
+          <w:sz w:val="28"/>
+          <w:szCs w:val="28"/>
+        </w:rPr>
+        <w:t xml:space="preserve"> </w:t>
+      </w:r>
+      <w:proofErr w:type="spellStart"/>
+      <w:r>
+        <w:rPr>
+          <w:rFonts w:ascii="Times New Roman" w:hAnsi="Times New Roman" w:cs="Times New Roman"/>
+          <w:bCs/>
+          <w:color w:val="000000" w:themeColor="text1"/>
+          <w:sz w:val="28"/>
+          <w:szCs w:val="28"/>
+        </w:rPr>
+        <w:t>và</w:t>
+      </w:r>
+      <w:proofErr w:type="spellEnd"/>
+      <w:r>
+        <w:rPr>
+          <w:rFonts w:ascii="Times New Roman" w:hAnsi="Times New Roman" w:cs="Times New Roman"/>
+          <w:bCs/>
+          <w:color w:val="000000" w:themeColor="text1"/>
+          <w:sz w:val="28"/>
+          <w:szCs w:val="28"/>
+        </w:rPr>
+        <w:t xml:space="preserve"> </w:t>
+      </w:r>
+      <w:proofErr w:type="spellStart"/>
+      <w:r>
+        <w:rPr>
+          <w:rFonts w:ascii="Times New Roman" w:hAnsi="Times New Roman" w:cs="Times New Roman"/>
+          <w:bCs/>
+          <w:color w:val="000000" w:themeColor="text1"/>
+          <w:sz w:val="28"/>
+          <w:szCs w:val="28"/>
+        </w:rPr>
+        <w:t>xuất</w:t>
+      </w:r>
+      <w:proofErr w:type="spellEnd"/>
+      <w:r>
+        <w:rPr>
+          <w:rFonts w:ascii="Times New Roman" w:hAnsi="Times New Roman" w:cs="Times New Roman"/>
+          <w:bCs/>
+          <w:color w:val="000000" w:themeColor="text1"/>
+          <w:sz w:val="28"/>
+          <w:szCs w:val="28"/>
+        </w:rPr>
+        <w:t xml:space="preserve"> </w:t>
+      </w:r>
+      <w:proofErr w:type="spellStart"/>
+      <w:r>
+        <w:rPr>
+          <w:rFonts w:ascii="Times New Roman" w:hAnsi="Times New Roman" w:cs="Times New Roman"/>
+          <w:bCs/>
+          <w:color w:val="000000" w:themeColor="text1"/>
+          <w:sz w:val="28"/>
+          <w:szCs w:val="28"/>
+        </w:rPr>
+        <w:t>kết</w:t>
+      </w:r>
+      <w:proofErr w:type="spellEnd"/>
+      <w:r>
+        <w:rPr>
+          <w:rFonts w:ascii="Times New Roman" w:hAnsi="Times New Roman" w:cs="Times New Roman"/>
+          <w:bCs/>
+          <w:color w:val="000000" w:themeColor="text1"/>
+          <w:sz w:val="28"/>
+          <w:szCs w:val="28"/>
+        </w:rPr>
+        <w:t xml:space="preserve"> </w:t>
+      </w:r>
+      <w:proofErr w:type="spellStart"/>
+      <w:r>
+        <w:rPr>
+          <w:rFonts w:ascii="Times New Roman" w:hAnsi="Times New Roman" w:cs="Times New Roman"/>
+          <w:bCs/>
+          <w:color w:val="000000" w:themeColor="text1"/>
+          <w:sz w:val="28"/>
+          <w:szCs w:val="28"/>
+        </w:rPr>
+        <w:t>quả</w:t>
+      </w:r>
+      <w:proofErr w:type="spellEnd"/>
     </w:p>
     <w:p>
       <w:pPr>
@@ -1933,6 +4378,7 @@
           <w:szCs w:val="36"/>
         </w:rPr>
       </w:pPr>
+      <w:proofErr w:type="spellStart"/>
       <w:r>
         <w:rPr>
           <w:rFonts w:ascii="Times New Roman" w:hAnsi="Times New Roman" w:cs="Times New Roman"/>
@@ -1941,24 +4387,59 @@
           <w:sz w:val="36"/>
           <w:szCs w:val="36"/>
         </w:rPr>
-        <w:t>Bài làm</w:t>
-      </w:r>
-    </w:p>
-    <w:p>
-      <w:pPr>
-        <w:spacing w:before="120" w:after="120" w:line="360" w:lineRule="auto"/>
-        <w:rPr>
-          <w:rFonts w:ascii="Times New Roman" w:hAnsi="Times New Roman" w:cs="Times New Roman"/>
-          <w:b/>
+        <w:t>Bài</w:t>
+      </w:r>
+      <w:proofErr w:type="spellEnd"/>
+      <w:r>
+        <w:rPr>
+          <w:rFonts w:ascii="Times New Roman" w:hAnsi="Times New Roman" w:cs="Times New Roman"/>
+          <w:bCs/>
           <w:color w:val="000000" w:themeColor="text1"/>
           <w:sz w:val="36"/>
           <w:szCs w:val="36"/>
         </w:rPr>
-      </w:pPr>
+        <w:t xml:space="preserve"> </w:t>
+      </w:r>
+      <w:proofErr w:type="spellStart"/>
+      <w:r>
+        <w:rPr>
+          <w:rFonts w:ascii="Times New Roman" w:hAnsi="Times New Roman" w:cs="Times New Roman"/>
+          <w:bCs/>
+          <w:color w:val="000000" w:themeColor="text1"/>
+          <w:sz w:val="36"/>
+          <w:szCs w:val="36"/>
+        </w:rPr>
+        <w:t>làm</w:t>
+      </w:r>
+      <w:proofErr w:type="spellEnd"/>
+    </w:p>
+    <w:p>
+      <w:pPr>
+        <w:spacing w:before="120" w:after="120" w:line="360" w:lineRule="auto"/>
+        <w:rPr>
+          <w:rFonts w:ascii="Times New Roman" w:hAnsi="Times New Roman" w:cs="Times New Roman"/>
+          <w:b/>
+          <w:color w:val="000000" w:themeColor="text1"/>
+          <w:sz w:val="36"/>
+          <w:szCs w:val="36"/>
+        </w:rPr>
+      </w:pPr>
+      <w:hyperlink r:id="rId9" w:history="1">
+        <w:r>
+          <w:rPr>
+            <w:rStyle w:val="Hyperlink"/>
+            <w:rFonts w:ascii="Times New Roman" w:hAnsi="Times New Roman" w:cs="Times New Roman"/>
+            <w:b/>
+            <w:sz w:val="36"/>
+            <w:szCs w:val="36"/>
+          </w:rPr>
+          <w:t>https://github.com/luanhocuit/OOP</w:t>
+        </w:r>
+      </w:hyperlink>
     </w:p>
     <w:sectPr>
-      <w:headerReference w:type="default" r:id="rId9"/>
-      <w:footerReference w:type="default" r:id="rId10"/>
+      <w:headerReference w:type="default" r:id="rId10"/>
+      <w:footerReference w:type="default" r:id="rId11"/>
       <w:pgSz w:w="11906" w:h="16838"/>
       <w:pgMar w:top="1134" w:right="1134" w:bottom="1134" w:left="1701" w:header="720" w:footer="0" w:gutter="0"/>
       <w:pgBorders w:zOrder="back" w:display="firstPage" w:offsetFrom="page">

</xml_diff>